<commit_message>
primera versión previa al envio
</commit_message>
<xml_diff>
--- a/2.1+Propuesta+(estudiante).+Trabajo+de+grado_V2.docx
+++ b/2.1+Propuesta+(estudiante).+Trabajo+de+grado_V2.docx
@@ -8,8 +8,6 @@
         <w:jc w:val="center"/>
         <w:rPr>
           <w:rFonts w:ascii="Arial" w:hAnsi="Arial"/>
-          <w:sz w:val="24"/>
-          <w:szCs w:val="24"/>
         </w:rPr>
       </w:pPr>
       <w:r>
@@ -37,8 +35,6 @@
         <w:jc w:val="center"/>
         <w:rPr>
           <w:rFonts w:ascii="Arial" w:hAnsi="Arial"/>
-          <w:sz w:val="24"/>
-          <w:szCs w:val="24"/>
         </w:rPr>
       </w:pPr>
       <w:r>
@@ -91,8 +87,6 @@
         <w:jc w:val="center"/>
         <w:rPr>
           <w:rFonts w:ascii="Arial" w:hAnsi="Arial"/>
-          <w:sz w:val="24"/>
-          <w:szCs w:val="24"/>
         </w:rPr>
       </w:pPr>
       <w:r>
@@ -152,8 +146,6 @@
               <w:jc w:val="center"/>
               <w:rPr>
                 <w:rFonts w:ascii="Arial" w:hAnsi="Arial"/>
-                <w:sz w:val="24"/>
-                <w:szCs w:val="24"/>
               </w:rPr>
             </w:pPr>
             <w:r>
@@ -192,8 +184,6 @@
               <w:spacing w:lineRule="auto" w:line="360"/>
               <w:rPr>
                 <w:rFonts w:ascii="Arial" w:hAnsi="Arial"/>
-                <w:sz w:val="24"/>
-                <w:szCs w:val="24"/>
               </w:rPr>
             </w:pPr>
             <w:r>
@@ -265,8 +255,6 @@
               <w:spacing w:lineRule="auto" w:line="360"/>
               <w:rPr>
                 <w:rFonts w:ascii="Arial" w:hAnsi="Arial"/>
-                <w:sz w:val="24"/>
-                <w:szCs w:val="24"/>
               </w:rPr>
             </w:pPr>
             <w:r>
@@ -338,8 +326,6 @@
               <w:spacing w:lineRule="auto" w:line="360"/>
               <w:rPr>
                 <w:rFonts w:ascii="Arial" w:hAnsi="Arial"/>
-                <w:sz w:val="24"/>
-                <w:szCs w:val="24"/>
               </w:rPr>
             </w:pPr>
             <w:r>
@@ -411,8 +397,6 @@
               <w:spacing w:lineRule="auto" w:line="360"/>
               <w:rPr>
                 <w:rFonts w:ascii="Arial" w:hAnsi="Arial"/>
-                <w:sz w:val="24"/>
-                <w:szCs w:val="24"/>
               </w:rPr>
             </w:pPr>
             <w:r>
@@ -484,8 +468,6 @@
               <w:spacing w:lineRule="auto" w:line="360"/>
               <w:rPr>
                 <w:rFonts w:ascii="Arial" w:hAnsi="Arial"/>
-                <w:sz w:val="24"/>
-                <w:szCs w:val="24"/>
               </w:rPr>
             </w:pPr>
             <w:r>
@@ -557,8 +539,6 @@
               <w:spacing w:lineRule="auto" w:line="360"/>
               <w:rPr>
                 <w:rFonts w:ascii="Arial" w:hAnsi="Arial"/>
-                <w:sz w:val="24"/>
-                <w:szCs w:val="24"/>
               </w:rPr>
             </w:pPr>
             <w:r>
@@ -591,8 +571,6 @@
               <w:spacing w:lineRule="auto" w:line="360"/>
               <w:rPr>
                 <w:rFonts w:ascii="Arial" w:hAnsi="Arial"/>
-                <w:sz w:val="24"/>
-                <w:szCs w:val="24"/>
               </w:rPr>
             </w:pPr>
             <w:r>
@@ -631,8 +609,6 @@
               <w:spacing w:lineRule="auto" w:line="360"/>
               <w:rPr>
                 <w:rFonts w:ascii="Arial" w:hAnsi="Arial"/>
-                <w:sz w:val="24"/>
-                <w:szCs w:val="24"/>
               </w:rPr>
             </w:pPr>
             <w:r>
@@ -665,8 +641,6 @@
               <w:spacing w:lineRule="auto" w:line="360"/>
               <w:rPr>
                 <w:rFonts w:ascii="Arial" w:hAnsi="Arial"/>
-                <w:sz w:val="24"/>
-                <w:szCs w:val="24"/>
               </w:rPr>
             </w:pPr>
             <w:r>
@@ -775,8 +749,6 @@
               <w:jc w:val="center"/>
               <w:rPr>
                 <w:rFonts w:ascii="Arial" w:hAnsi="Arial"/>
-                <w:sz w:val="24"/>
-                <w:szCs w:val="24"/>
               </w:rPr>
             </w:pPr>
             <w:r>
@@ -815,8 +787,6 @@
               <w:spacing w:lineRule="auto" w:line="360"/>
               <w:rPr>
                 <w:rFonts w:ascii="Arial" w:hAnsi="Arial"/>
-                <w:sz w:val="24"/>
-                <w:szCs w:val="24"/>
               </w:rPr>
             </w:pPr>
             <w:r>
@@ -894,8 +864,6 @@
               <w:spacing w:lineRule="auto" w:line="360"/>
               <w:rPr>
                 <w:rFonts w:ascii="Arial" w:hAnsi="Arial"/>
-                <w:sz w:val="24"/>
-                <w:szCs w:val="24"/>
               </w:rPr>
             </w:pPr>
             <w:r>
@@ -973,8 +941,6 @@
               <w:spacing w:lineRule="auto" w:line="360"/>
               <w:rPr>
                 <w:rFonts w:ascii="Arial" w:hAnsi="Arial"/>
-                <w:sz w:val="24"/>
-                <w:szCs w:val="24"/>
               </w:rPr>
             </w:pPr>
             <w:r>
@@ -1054,8 +1020,6 @@
               <w:spacing w:lineRule="auto" w:line="360"/>
               <w:rPr>
                 <w:rFonts w:ascii="Arial" w:hAnsi="Arial"/>
-                <w:sz w:val="24"/>
-                <w:szCs w:val="24"/>
               </w:rPr>
             </w:pPr>
             <w:r>
@@ -1206,8 +1170,6 @@
               <w:jc w:val="center"/>
               <w:rPr>
                 <w:rFonts w:ascii="Arial" w:hAnsi="Arial"/>
-                <w:sz w:val="24"/>
-                <w:szCs w:val="24"/>
               </w:rPr>
             </w:pPr>
             <w:r>
@@ -1246,8 +1208,6 @@
               <w:spacing w:lineRule="auto" w:line="360"/>
               <w:rPr>
                 <w:rFonts w:ascii="Arial" w:hAnsi="Arial"/>
-                <w:sz w:val="24"/>
-                <w:szCs w:val="24"/>
               </w:rPr>
             </w:pPr>
             <w:r>
@@ -1321,8 +1281,6 @@
               <w:spacing w:lineRule="auto" w:line="360"/>
               <w:rPr>
                 <w:rFonts w:ascii="Arial" w:hAnsi="Arial"/>
-                <w:sz w:val="24"/>
-                <w:szCs w:val="24"/>
               </w:rPr>
             </w:pPr>
             <w:r>
@@ -1396,8 +1354,6 @@
               <w:spacing w:lineRule="auto" w:line="360"/>
               <w:rPr>
                 <w:rFonts w:ascii="Arial" w:hAnsi="Arial"/>
-                <w:sz w:val="24"/>
-                <w:szCs w:val="24"/>
               </w:rPr>
             </w:pPr>
             <w:r>
@@ -1471,8 +1427,6 @@
               <w:spacing w:lineRule="auto" w:line="360"/>
               <w:rPr>
                 <w:rFonts w:ascii="Arial" w:hAnsi="Arial"/>
-                <w:sz w:val="24"/>
-                <w:szCs w:val="24"/>
               </w:rPr>
             </w:pPr>
             <w:r>
@@ -1546,8 +1500,6 @@
               <w:spacing w:lineRule="auto" w:line="360"/>
               <w:rPr>
                 <w:rFonts w:ascii="Arial" w:hAnsi="Arial"/>
-                <w:sz w:val="24"/>
-                <w:szCs w:val="24"/>
               </w:rPr>
             </w:pPr>
             <w:r>
@@ -1621,8 +1573,6 @@
               <w:spacing w:lineRule="auto" w:line="360"/>
               <w:rPr>
                 <w:rFonts w:ascii="Arial" w:hAnsi="Arial"/>
-                <w:sz w:val="24"/>
-                <w:szCs w:val="24"/>
               </w:rPr>
             </w:pPr>
             <w:r>
@@ -1749,8 +1699,6 @@
         <w:jc w:val="both"/>
         <w:rPr>
           <w:rFonts w:ascii="Arial" w:hAnsi="Arial"/>
-          <w:sz w:val="24"/>
-          <w:szCs w:val="24"/>
         </w:rPr>
       </w:pPr>
       <w:r>
@@ -1780,8 +1728,6 @@
         <w:jc w:val="both"/>
         <w:rPr>
           <w:rFonts w:ascii="Arial" w:hAnsi="Arial"/>
-          <w:sz w:val="24"/>
-          <w:szCs w:val="24"/>
         </w:rPr>
       </w:pPr>
       <w:r>
@@ -1832,8 +1778,6 @@
         <w:jc w:val="both"/>
         <w:rPr>
           <w:rFonts w:ascii="Arial" w:hAnsi="Arial"/>
-          <w:sz w:val="24"/>
-          <w:szCs w:val="24"/>
         </w:rPr>
       </w:pPr>
       <w:r>
@@ -1877,8 +1821,6 @@
         <w:pStyle w:val="normal1"/>
         <w:rPr>
           <w:rFonts w:ascii="Arial" w:hAnsi="Arial"/>
-          <w:sz w:val="24"/>
-          <w:szCs w:val="24"/>
         </w:rPr>
       </w:pPr>
       <w:r>
@@ -1921,8 +1863,6 @@
         <w:pStyle w:val="normal1"/>
         <w:rPr>
           <w:rFonts w:ascii="Arial" w:hAnsi="Arial"/>
-          <w:sz w:val="24"/>
-          <w:szCs w:val="24"/>
         </w:rPr>
       </w:pPr>
       <w:r>
@@ -1963,65 +1903,15 @@
         <w:jc w:val="both"/>
         <w:rPr>
           <w:rFonts w:ascii="Arial" w:hAnsi="Arial"/>
-          <w:sz w:val="24"/>
-          <w:szCs w:val="24"/>
-        </w:rPr>
-      </w:pPr>
-      <w:r>
-        <w:rPr>
-          <w:rFonts w:eastAsia="Arial" w:cs="Arial" w:ascii="Arial" w:hAnsi="Arial"/>
-          <w:sz w:val="24"/>
-          <w:szCs w:val="24"/>
-        </w:rPr>
-        <w:t xml:space="preserve">Los modelos de aprendizaje autosupervisado han revolucionado la manera en que se generan representaciones de habla, permitiendo capturar estructuras acústicas y lingüísticas ricas a partir de grandes volúmenes de audio sin necesidad de transcripciones o etiquetas manuales </w:t>
-      </w:r>
-      <w:r>
-        <w:rPr>
-          <w:rFonts w:eastAsia="Arial" w:cs="Arial" w:ascii="Arial" w:hAnsi="Arial"/>
-          <w:sz w:val="24"/>
-          <w:szCs w:val="24"/>
-        </w:rPr>
-        <w:t>[6]</w:t>
-      </w:r>
-      <w:r>
-        <w:rPr>
-          <w:rFonts w:eastAsia="Arial" w:cs="Arial" w:ascii="Arial" w:hAnsi="Arial"/>
-          <w:sz w:val="24"/>
-          <w:szCs w:val="24"/>
-        </w:rPr>
-        <w:t xml:space="preserve">. Este paradigma, sin embargo, no elimina la dependencia de datos: el pre entrenamiento se apoya en corpus masivos no etiquetados, y el ajuste posterior a una tarea específica (el fine-tuning) asume también la disponibilidad de conjuntos de datos etiquetados suficientemente amplios para ajustar el gran número de parámetros que un modelo de este tamaño requiere. Esta suposición representa un gran problema al trasladar estos métodos al dominio clínico de las enfermedades neurodegenerativas: las bases de datos de habla con etiquetas de Alzheimer disponibles públicamente son, por naturaleza, reducidos. ADReSS reúne apenas 156 hablantes </w:t>
-      </w:r>
-      <w:r>
-        <w:rPr>
-          <w:rFonts w:eastAsia="Arial" w:cs="Arial" w:ascii="Arial" w:hAnsi="Arial"/>
-          <w:sz w:val="24"/>
-          <w:szCs w:val="24"/>
-        </w:rPr>
-        <w:t>[7]</w:t>
-      </w:r>
-      <w:r>
-        <w:rPr>
-          <w:rFonts w:eastAsia="Arial" w:cs="Arial" w:ascii="Arial" w:hAnsi="Arial"/>
-          <w:sz w:val="24"/>
-          <w:szCs w:val="24"/>
-        </w:rPr>
-        <w:t xml:space="preserve">, ADReSSo 237 </w:t>
-      </w:r>
-      <w:r>
-        <w:rPr>
-          <w:rFonts w:eastAsia="Arial" w:cs="Arial" w:ascii="Arial" w:hAnsi="Arial"/>
-          <w:sz w:val="24"/>
-          <w:szCs w:val="24"/>
-        </w:rPr>
-        <w:t>[8]</w:t>
-      </w:r>
-      <w:r>
-        <w:rPr>
-          <w:rFonts w:eastAsia="Arial" w:cs="Arial" w:ascii="Arial" w:hAnsi="Arial"/>
-          <w:sz w:val="24"/>
-          <w:szCs w:val="24"/>
-        </w:rPr>
-        <w:t xml:space="preserve">, esta cantidad de muestras es órdenes de magnitud menores que los corpus empleados para el pre entrenamiento de wav 2 vec 2.0. </w:t>
+        </w:rPr>
+      </w:pPr>
+      <w:r>
+        <w:rPr>
+          <w:rFonts w:eastAsia="Arial" w:cs="Arial" w:ascii="Arial" w:hAnsi="Arial"/>
+          <w:sz w:val="24"/>
+          <w:szCs w:val="24"/>
+        </w:rPr>
+        <w:t xml:space="preserve">Los modelos de aprendizaje autosupervisado han revolucionado la manera en que se generan representaciones de habla, permitiendo capturar estructuras acústicas y lingüísticas ricas a partir de grandes volúmenes de audio sin necesidad de transcripciones o etiquetas manuales [6]. Este paradigma, sin embargo, no elimina la dependencia de datos: el pre entrenamiento se apoya en corpus masivos no etiquetados, y el ajuste posterior a una tarea específica (el fine-tuning) asume también la disponibilidad de conjuntos de datos etiquetados suficientemente amplios para ajustar el gran número de parámetros que un modelo de este tamaño requiere. Esta suposición representa un gran problema al trasladar estos métodos al dominio clínico de las enfermedades neurodegenerativas: las bases de datos de habla con etiquetas de Alzheimer disponibles públicamente son, por naturaleza, reducidos. ADReSS reúne apenas 156 hablantes [7], ADReSSo 237 [8], esta cantidad de muestras es órdenes de magnitud menores que los corpus empleados para el pre entrenamiento de wav 2 vec 2.0. </w:t>
       </w:r>
     </w:p>
     <w:p>
@@ -2031,8 +1921,6 @@
         <w:jc w:val="both"/>
         <w:rPr>
           <w:rFonts w:ascii="Arial" w:hAnsi="Arial"/>
-          <w:sz w:val="24"/>
-          <w:szCs w:val="24"/>
         </w:rPr>
       </w:pPr>
       <w:r>
@@ -2051,65 +1939,15 @@
         <w:jc w:val="both"/>
         <w:rPr>
           <w:rFonts w:ascii="Arial" w:hAnsi="Arial"/>
-          <w:sz w:val="24"/>
-          <w:szCs w:val="24"/>
-        </w:rPr>
-      </w:pPr>
-      <w:r>
-        <w:rPr>
-          <w:rFonts w:eastAsia="Arial" w:cs="Arial" w:ascii="Arial" w:hAnsi="Arial"/>
-          <w:sz w:val="24"/>
-          <w:szCs w:val="24"/>
-        </w:rPr>
-        <w:t xml:space="preserve">Frente a esta escasez de datos, el ajuste eficiente de parámetros (PEFT) constituye una alternativa que permite adaptar modelos pre entrenados de gran tamaño actualizando solo una fracción reducida de sus parámetros, en contraste con el ajuste fino completo, que requiere modificar la totalidad de los pesos del modelo.  Se propone así aplicar y comparar cuatro estrategias de adaptación sobre wav2vec 2.0 para la tarea de clasificación binaria entre hablantes con Alzheimer y controles sanos: adaptadores tipo bottleneck, que insertan módulos secuenciales de baja dimensionalidad entre las capas del modelo </w:t>
-      </w:r>
-      <w:r>
-        <w:rPr>
-          <w:rFonts w:eastAsia="Arial" w:cs="Arial" w:ascii="Arial" w:hAnsi="Arial"/>
-          <w:sz w:val="24"/>
-          <w:szCs w:val="24"/>
-        </w:rPr>
-        <w:t>[9]</w:t>
-      </w:r>
-      <w:r>
-        <w:rPr>
-          <w:rFonts w:eastAsia="Arial" w:cs="Arial" w:ascii="Arial" w:hAnsi="Arial"/>
-          <w:sz w:val="24"/>
-          <w:szCs w:val="24"/>
-        </w:rPr>
-        <w:t xml:space="preserve">; LoRA, que introduce una corrección de bajo rango sobre las matrices de pesos existentes sin modificarlas directamente </w:t>
-      </w:r>
-      <w:r>
-        <w:rPr>
-          <w:rFonts w:eastAsia="Arial" w:cs="Arial" w:ascii="Arial" w:hAnsi="Arial"/>
-          <w:sz w:val="24"/>
-          <w:szCs w:val="24"/>
-        </w:rPr>
-        <w:t>[10]</w:t>
-      </w:r>
-      <w:r>
-        <w:rPr>
-          <w:rFonts w:eastAsia="Arial" w:cs="Arial" w:ascii="Arial" w:hAnsi="Arial"/>
-          <w:sz w:val="24"/>
-          <w:szCs w:val="24"/>
-        </w:rPr>
-        <w:t xml:space="preserve">; prefix-tuning, que antepone vectores aprendibles al espacio de claves y valores del mecanismo de atención </w:t>
-      </w:r>
-      <w:r>
-        <w:rPr>
-          <w:rFonts w:eastAsia="Arial" w:cs="Arial" w:ascii="Arial" w:hAnsi="Arial"/>
-          <w:sz w:val="24"/>
-          <w:szCs w:val="24"/>
-        </w:rPr>
-        <w:t>[11]</w:t>
-      </w:r>
-      <w:r>
-        <w:rPr>
-          <w:rFonts w:eastAsia="Arial" w:cs="Arial" w:ascii="Arial" w:hAnsi="Arial"/>
-          <w:sz w:val="24"/>
-          <w:szCs w:val="24"/>
-        </w:rPr>
-        <w:t xml:space="preserve">; y el descongelamiento parcial de las últimas n capas del modelo, como forma más directa de ajuste. Estas cuatro estrategias serán evaluadas frente a un mismo punto de referencia fijo: wav2vec 2.0 sin ningún ajuste de sus pesos. A partir de este diseño experimental, la presente propuesta plantea como hipótesis central que el ajuste del modelo, mediante cualquiera de las estrategias mencionadas, permite obtener un desempeño de clasificación superior al del modelo congelado, incluso en condiciones de datos etiquetados limitados. </w:t>
+        </w:rPr>
+      </w:pPr>
+      <w:r>
+        <w:rPr>
+          <w:rFonts w:eastAsia="Arial" w:cs="Arial" w:ascii="Arial" w:hAnsi="Arial"/>
+          <w:sz w:val="24"/>
+          <w:szCs w:val="24"/>
+        </w:rPr>
+        <w:t xml:space="preserve">Frente a esta escasez de datos, el ajuste eficiente de parámetros (PEFT) constituye una alternativa que permite adaptar modelos pre entrenados de gran tamaño actualizando solo una fracción reducida de sus parámetros, en contraste con el ajuste fino completo, que requiere modificar la totalidad de los pesos del modelo.  Se propone así aplicar y comparar cuatro estrategias de adaptación sobre wav2vec 2.0 para la tarea de clasificación binaria entre hablantes con Alzheimer y controles sanos: adaptadores tipo bottleneck, que insertan módulos secuenciales de baja dimensionalidad entre las capas del modelo [9]; LoRA, que introduce una corrección de bajo rango sobre las matrices de pesos existentes sin modificarlas directamente [10]; prefix-tuning, que antepone vectores aprendibles al espacio de claves y valores del mecanismo de atención [11]; y el descongelamiento parcial de las últimas n capas del modelo, como forma más directa de ajuste. Estas cuatro estrategias serán evaluadas frente a un mismo punto de referencia fijo: wav2vec 2.0 sin ningún ajuste de sus pesos. A partir de este diseño experimental, la presente propuesta plantea como hipótesis central que el ajuste del modelo, mediante cualquiera de las estrategias mencionadas, permite obtener un desempeño de clasificación superior al del modelo congelado, incluso en condiciones de datos etiquetados limitados. </w:t>
       </w:r>
     </w:p>
     <w:p>
@@ -2368,8 +2206,6 @@
         <w:jc w:val="both"/>
         <w:rPr>
           <w:rFonts w:ascii="Arial" w:hAnsi="Arial"/>
-          <w:sz w:val="24"/>
-          <w:szCs w:val="24"/>
         </w:rPr>
       </w:pPr>
       <w:r>
@@ -2391,41 +2227,31 @@
         <w:pStyle w:val="normal1"/>
         <w:jc w:val="both"/>
         <w:rPr>
-          <w:rFonts w:ascii="Arial" w:hAnsi="Arial" w:eastAsia="Arial" w:cs="Arial"/>
+          <w:rFonts w:ascii="Arial" w:hAnsi="Arial"/>
+        </w:rPr>
+      </w:pPr>
+      <w:r>
+        <w:rPr>
+          <w:rFonts w:ascii="Arial" w:hAnsi="Arial"/>
+        </w:rPr>
+      </w:r>
+    </w:p>
+    <w:p>
+      <w:pPr>
+        <w:pStyle w:val="normal1"/>
+        <w:jc w:val="both"/>
+        <w:rPr>
+          <w:rFonts w:ascii="Arial" w:hAnsi="Arial"/>
+        </w:rPr>
+      </w:pPr>
+      <w:r>
+        <w:rPr>
+          <w:rFonts w:eastAsia="Arial" w:cs="Arial" w:ascii="Arial" w:hAnsi="Arial"/>
           <w:b/>
           <w:bCs/>
           <w:sz w:val="24"/>
           <w:szCs w:val="24"/>
         </w:rPr>
-      </w:pPr>
-      <w:r>
-        <w:rPr>
-          <w:rFonts w:eastAsia="Arial" w:cs="Arial" w:ascii="Arial" w:hAnsi="Arial"/>
-          <w:b/>
-          <w:bCs/>
-          <w:sz w:val="24"/>
-          <w:szCs w:val="24"/>
-        </w:rPr>
-      </w:r>
-    </w:p>
-    <w:p>
-      <w:pPr>
-        <w:pStyle w:val="normal1"/>
-        <w:jc w:val="both"/>
-        <w:rPr>
-          <w:rFonts w:ascii="Arial" w:hAnsi="Arial"/>
-          <w:sz w:val="24"/>
-          <w:szCs w:val="24"/>
-        </w:rPr>
-      </w:pPr>
-      <w:r>
-        <w:rPr>
-          <w:rFonts w:eastAsia="Arial" w:cs="Arial" w:ascii="Arial" w:hAnsi="Arial"/>
-          <w:b/>
-          <w:bCs/>
-          <w:sz w:val="24"/>
-          <w:szCs w:val="24"/>
-        </w:rPr>
         <w:t>Objetivo general</w:t>
       </w:r>
     </w:p>
@@ -2435,41 +2261,23 @@
         <w:spacing w:lineRule="auto" w:line="240" w:before="240" w:after="240"/>
         <w:rPr>
           <w:rFonts w:ascii="Arial" w:hAnsi="Arial"/>
-          <w:sz w:val="24"/>
-          <w:szCs w:val="24"/>
-        </w:rPr>
-      </w:pPr>
-      <w:r>
-        <w:rPr>
-          <w:rFonts w:eastAsia="Arial" w:cs="Arial" w:ascii="Arial" w:hAnsi="Arial"/>
-          <w:sz w:val="24"/>
-          <w:szCs w:val="24"/>
-        </w:rPr>
-        <w:t>Implementar y evaluar</w:t>
-      </w:r>
-      <w:r>
-        <w:rPr>
-          <w:rFonts w:eastAsia="Arial" w:cs="Arial" w:ascii="Arial" w:hAnsi="Arial"/>
-          <w:sz w:val="24"/>
-          <w:szCs w:val="24"/>
-        </w:rPr>
-        <w:t xml:space="preserve"> distintas estrategias de ajuste de parámetros sobre wav2vec 2.0 en la clasificación de habla </w:t>
-      </w:r>
-      <w:r>
-        <w:rPr>
-          <w:rFonts w:eastAsia="Arial" w:cs="Arial" w:ascii="Arial" w:hAnsi="Arial"/>
-          <w:sz w:val="24"/>
-          <w:szCs w:val="24"/>
-        </w:rPr>
-        <w:t>en</w:t>
-      </w:r>
-      <w:r>
-        <w:rPr>
-          <w:rFonts w:eastAsia="Arial" w:cs="Arial" w:ascii="Arial" w:hAnsi="Arial"/>
-          <w:sz w:val="24"/>
-          <w:szCs w:val="24"/>
-        </w:rPr>
-        <w:t xml:space="preserve"> personas con Alzheimer frente a controles sanos.</w:t>
+        </w:rPr>
+      </w:pPr>
+      <w:r>
+        <w:rPr>
+          <w:rFonts w:eastAsia="Arial" w:cs="Arial" w:ascii="Arial" w:hAnsi="Arial"/>
+          <w:sz w:val="24"/>
+          <w:szCs w:val="24"/>
+        </w:rPr>
+        <w:t xml:space="preserve">Desarrollar una </w:t>
+      </w:r>
+      <w:r>
+        <w:rPr>
+          <w:rFonts w:eastAsia="Arial" w:cs="Arial" w:ascii="Arial" w:hAnsi="Arial"/>
+          <w:sz w:val="24"/>
+          <w:szCs w:val="24"/>
+        </w:rPr>
+        <w:t>estrategia de ajuste de parámetros sobre modelos fundacionales auto-supervisados, como wav2vec 2.0, para la clasificación de pacientes con enfermedad de Alzheimer frente a controles sanos en escenarios de datos clínicos limitados.</w:t>
       </w:r>
     </w:p>
     <w:p>
@@ -2478,8 +2286,6 @@
         <w:spacing w:lineRule="auto" w:line="240" w:before="240" w:after="240"/>
         <w:rPr>
           <w:rFonts w:ascii="Arial" w:hAnsi="Arial"/>
-          <w:sz w:val="24"/>
-          <w:szCs w:val="24"/>
         </w:rPr>
       </w:pPr>
       <w:r>
@@ -2504,25 +2310,27 @@
         <w:ind w:hanging="360" w:left="720"/>
         <w:rPr>
           <w:rFonts w:ascii="Arial" w:hAnsi="Arial"/>
-          <w:sz w:val="24"/>
-          <w:szCs w:val="24"/>
-        </w:rPr>
-      </w:pPr>
-      <w:r>
-        <w:rPr>
-          <w:rFonts w:eastAsia="Arial" w:cs="Arial" w:ascii="Arial" w:hAnsi="Arial"/>
-          <w:sz w:val="24"/>
-          <w:szCs w:val="24"/>
-        </w:rPr>
-        <w:t xml:space="preserve">Caracterizar el desempeño de clasificación de wav2vec 2.0 sin ajuste de pesos, </w:t>
-      </w:r>
-      <w:r>
-        <w:rPr>
-          <w:rFonts w:eastAsia="Arial" w:cs="Arial" w:ascii="Arial" w:hAnsi="Arial"/>
-          <w:sz w:val="24"/>
-          <w:szCs w:val="24"/>
-        </w:rPr>
-        <w:t>para la clasificación binaria de habla en personas con Alzheimer frente a controles sanos.</w:t>
+        </w:rPr>
+      </w:pPr>
+      <w:commentRangeStart w:id="0"/>
+      <w:r>
+        <w:rPr>
+          <w:rFonts w:eastAsia="Arial" w:cs="Arial" w:ascii="Arial" w:hAnsi="Arial"/>
+          <w:sz w:val="24"/>
+          <w:szCs w:val="24"/>
+        </w:rPr>
+        <w:t>Establecer una línea base de clasificación de pacientes con enfermedad de Alzheimer y sujetos de control mediante el uso de representaciones extraídas por wav2vec 2.0 sin ajuste de parámetros.</w:t>
+      </w:r>
+      <w:commentRangeEnd w:id="0"/>
+      <w:r>
+        <w:commentReference w:id="0"/>
+      </w:r>
+      <w:r>
+        <w:rPr>
+          <w:rFonts w:eastAsia="Arial" w:cs="Arial" w:ascii="Arial" w:hAnsi="Arial"/>
+          <w:sz w:val="24"/>
+          <w:szCs w:val="24"/>
+        </w:rPr>
       </w:r>
     </w:p>
     <w:p>
@@ -2536,26 +2344,143 @@
         <w:ind w:hanging="360" w:left="720"/>
         <w:rPr>
           <w:rFonts w:ascii="Arial" w:hAnsi="Arial"/>
-          <w:sz w:val="24"/>
-          <w:szCs w:val="24"/>
-        </w:rPr>
-      </w:pPr>
-      <w:commentRangeStart w:id="0"/>
-      <w:r>
-        <w:rPr>
-          <w:rFonts w:eastAsia="Arial" w:cs="Arial" w:ascii="Arial" w:hAnsi="Arial"/>
-          <w:sz w:val="24"/>
-          <w:szCs w:val="24"/>
-        </w:rPr>
-        <w:t>I</w:t>
-      </w:r>
-      <w:r>
-        <w:rPr>
-          <w:rFonts w:eastAsia="Arial" w:cs="Arial" w:ascii="Arial" w:hAnsi="Arial"/>
-          <w:sz w:val="24"/>
-          <w:szCs w:val="24"/>
-        </w:rPr>
-        <w:t>dentificar estrategias de ajuste de parametors</w:t>
+        </w:rPr>
+      </w:pPr>
+      <w:r>
+        <w:rPr>
+          <w:rFonts w:eastAsia="Arial" w:cs="Arial" w:ascii="Arial" w:hAnsi="Arial"/>
+          <w:sz w:val="24"/>
+          <w:szCs w:val="24"/>
+        </w:rPr>
+        <w:t>Identificar</w:t>
+      </w:r>
+      <w:r>
+        <w:rPr>
+          <w:rFonts w:eastAsia="Arial" w:cs="Arial" w:ascii="Arial" w:hAnsi="Arial"/>
+          <w:sz w:val="24"/>
+          <w:szCs w:val="24"/>
+        </w:rPr>
+        <w:t xml:space="preserve"> </w:t>
+      </w:r>
+      <w:r>
+        <w:rPr>
+          <w:rFonts w:eastAsia="Arial" w:cs="Arial" w:ascii="Arial" w:hAnsi="Arial"/>
+          <w:sz w:val="24"/>
+          <w:szCs w:val="24"/>
+        </w:rPr>
+        <w:t>estrategias</w:t>
+      </w:r>
+      <w:r>
+        <w:rPr>
+          <w:rFonts w:eastAsia="Arial" w:cs="Arial" w:ascii="Arial" w:hAnsi="Arial"/>
+          <w:sz w:val="24"/>
+          <w:szCs w:val="24"/>
+        </w:rPr>
+        <w:t xml:space="preserve"> de</w:t>
+      </w:r>
+      <w:r>
+        <w:rPr>
+          <w:rFonts w:eastAsia="Arial" w:cs="Arial" w:ascii="Arial" w:hAnsi="Arial"/>
+          <w:sz w:val="24"/>
+          <w:szCs w:val="24"/>
+        </w:rPr>
+        <w:t xml:space="preserve"> ajuste de parámetros aplicables a la arquitectura de wav2vec 2.0 para</w:t>
+      </w:r>
+      <w:r>
+        <w:rPr>
+          <w:rFonts w:eastAsia="Arial" w:cs="Arial" w:ascii="Arial" w:hAnsi="Arial"/>
+          <w:sz w:val="24"/>
+          <w:szCs w:val="24"/>
+        </w:rPr>
+        <w:t xml:space="preserve"> tarea</w:t>
+      </w:r>
+      <w:r>
+        <w:rPr>
+          <w:rFonts w:eastAsia="Arial" w:cs="Arial" w:ascii="Arial" w:hAnsi="Arial"/>
+          <w:sz w:val="24"/>
+          <w:szCs w:val="24"/>
+        </w:rPr>
+        <w:t>s</w:t>
+      </w:r>
+      <w:r>
+        <w:rPr>
+          <w:rFonts w:eastAsia="Arial" w:cs="Arial" w:ascii="Arial" w:hAnsi="Arial"/>
+          <w:sz w:val="24"/>
+          <w:szCs w:val="24"/>
+        </w:rPr>
+        <w:t xml:space="preserve"> </w:t>
+      </w:r>
+      <w:r>
+        <w:rPr>
+          <w:rFonts w:eastAsia="Arial" w:cs="Arial" w:ascii="Arial" w:hAnsi="Arial"/>
+          <w:sz w:val="24"/>
+          <w:szCs w:val="24"/>
+        </w:rPr>
+        <w:t xml:space="preserve">de </w:t>
+      </w:r>
+      <w:r>
+        <w:rPr>
+          <w:rFonts w:eastAsia="Arial" w:cs="Arial" w:ascii="Arial" w:hAnsi="Arial"/>
+          <w:sz w:val="24"/>
+          <w:szCs w:val="24"/>
+        </w:rPr>
+        <w:t>clasifica</w:t>
+      </w:r>
+      <w:r>
+        <w:rPr>
+          <w:rFonts w:eastAsia="Arial" w:cs="Arial" w:ascii="Arial" w:hAnsi="Arial"/>
+          <w:sz w:val="24"/>
+          <w:szCs w:val="24"/>
+        </w:rPr>
+        <w:t xml:space="preserve">ción </w:t>
+      </w:r>
+      <w:r>
+        <w:rPr>
+          <w:rFonts w:eastAsia="Arial" w:cs="Arial" w:ascii="Arial" w:hAnsi="Arial"/>
+          <w:sz w:val="24"/>
+          <w:szCs w:val="24"/>
+        </w:rPr>
+        <w:t>binaria</w:t>
+      </w:r>
+      <w:r>
+        <w:rPr>
+          <w:rFonts w:eastAsia="Arial" w:cs="Arial" w:ascii="Arial" w:hAnsi="Arial"/>
+          <w:sz w:val="24"/>
+          <w:szCs w:val="24"/>
+        </w:rPr>
+        <w:t xml:space="preserve"> </w:t>
+      </w:r>
+      <w:r>
+        <w:rPr>
+          <w:rFonts w:eastAsia="Arial" w:cs="Arial" w:ascii="Arial" w:hAnsi="Arial"/>
+          <w:sz w:val="24"/>
+          <w:szCs w:val="24"/>
+        </w:rPr>
+        <w:t xml:space="preserve">en escenarios </w:t>
+      </w:r>
+      <w:r>
+        <w:rPr>
+          <w:rFonts w:eastAsia="Arial" w:cs="Arial" w:ascii="Arial" w:hAnsi="Arial"/>
+          <w:sz w:val="24"/>
+          <w:szCs w:val="24"/>
+        </w:rPr>
+        <w:t>con</w:t>
+      </w:r>
+      <w:r>
+        <w:rPr>
+          <w:rFonts w:eastAsia="Arial" w:cs="Arial" w:ascii="Arial" w:hAnsi="Arial"/>
+          <w:sz w:val="24"/>
+          <w:szCs w:val="24"/>
+        </w:rPr>
+        <w:t xml:space="preserve"> datos limitados</w:t>
+      </w:r>
+      <w:r>
+        <w:rPr>
+          <w:rFonts w:eastAsia="Arial" w:cs="Arial" w:ascii="Arial" w:hAnsi="Arial"/>
+          <w:sz w:val="24"/>
+          <w:szCs w:val="24"/>
+        </w:rPr>
+        <w:t>.</w:t>
       </w:r>
     </w:p>
     <w:p>
@@ -2565,31 +2490,142 @@
           <w:ilvl w:val="0"/>
           <w:numId w:val="1"/>
         </w:numPr>
-        <w:spacing w:lineRule="auto" w:line="240" w:beforeAutospacing="0" w:before="0" w:afterAutospacing="0" w:after="0"/>
+        <w:spacing w:lineRule="auto" w:line="240" w:before="240" w:afterAutospacing="0" w:after="0"/>
         <w:ind w:hanging="360" w:left="720"/>
         <w:rPr>
           <w:rFonts w:ascii="Arial" w:hAnsi="Arial"/>
-          <w:sz w:val="24"/>
-          <w:szCs w:val="24"/>
-        </w:rPr>
-      </w:pPr>
-      <w:r>
-        <w:rPr>
-          <w:rFonts w:eastAsia="Arial" w:cs="Arial" w:ascii="Arial" w:hAnsi="Arial"/>
-          <w:sz w:val="24"/>
-          <w:szCs w:val="24"/>
-        </w:rPr>
-        <w:t>Implementar las estrategias anteriores</w:t>
-      </w:r>
-      <w:commentRangeEnd w:id="0"/>
-      <w:r>
-        <w:commentReference w:id="0"/>
-      </w:r>
-      <w:r>
-        <w:rPr>
-          <w:rFonts w:eastAsia="Arial" w:cs="Arial" w:ascii="Arial" w:hAnsi="Arial"/>
-          <w:sz w:val="24"/>
-          <w:szCs w:val="24"/>
+        </w:rPr>
+      </w:pPr>
+      <w:r>
+        <w:rPr>
+          <w:rFonts w:eastAsia="Arial" w:cs="Arial" w:ascii="Arial" w:hAnsi="Arial"/>
+          <w:sz w:val="24"/>
+          <w:szCs w:val="24"/>
+        </w:rPr>
+        <w:t xml:space="preserve">Implementar </w:t>
+      </w:r>
+      <w:r>
+        <w:rPr>
+          <w:rFonts w:eastAsia="Arial" w:cs="Arial" w:ascii="Arial" w:hAnsi="Arial"/>
+          <w:sz w:val="24"/>
+          <w:szCs w:val="24"/>
+        </w:rPr>
+        <w:t xml:space="preserve">las estrategias de ajuste de parametros </w:t>
+      </w:r>
+      <w:r>
+        <w:rPr>
+          <w:rFonts w:eastAsia="Arial" w:cs="Arial" w:ascii="Arial" w:hAnsi="Arial"/>
+          <w:sz w:val="24"/>
+          <w:szCs w:val="24"/>
+        </w:rPr>
+        <w:t>seleccionadas</w:t>
+      </w:r>
+      <w:r>
+        <w:rPr>
+          <w:rFonts w:eastAsia="Arial" w:cs="Arial" w:ascii="Arial" w:hAnsi="Arial"/>
+          <w:sz w:val="24"/>
+          <w:szCs w:val="24"/>
+        </w:rPr>
+        <w:t xml:space="preserve"> </w:t>
+      </w:r>
+      <w:r>
+        <w:rPr>
+          <w:rFonts w:eastAsia="Arial" w:cs="Arial" w:ascii="Arial" w:hAnsi="Arial"/>
+          <w:sz w:val="24"/>
+          <w:szCs w:val="24"/>
+        </w:rPr>
+        <w:t>sobre</w:t>
+      </w:r>
+      <w:r>
+        <w:rPr>
+          <w:rFonts w:eastAsia="Arial" w:cs="Arial" w:ascii="Arial" w:hAnsi="Arial"/>
+          <w:sz w:val="24"/>
+          <w:szCs w:val="24"/>
+        </w:rPr>
+        <w:t xml:space="preserve"> el modelo </w:t>
+      </w:r>
+      <w:r>
+        <w:rPr>
+          <w:rFonts w:eastAsia="Arial" w:cs="Arial" w:ascii="Arial" w:hAnsi="Arial"/>
+          <w:sz w:val="24"/>
+          <w:szCs w:val="24"/>
+        </w:rPr>
+        <w:t xml:space="preserve">fundacional </w:t>
+      </w:r>
+      <w:r>
+        <w:rPr>
+          <w:rFonts w:eastAsia="Arial" w:cs="Arial" w:ascii="Arial" w:hAnsi="Arial"/>
+          <w:sz w:val="24"/>
+          <w:szCs w:val="24"/>
+        </w:rPr>
+        <w:t>wav2vec 2.0</w:t>
+      </w:r>
+      <w:r>
+        <w:rPr>
+          <w:rFonts w:eastAsia="Arial" w:cs="Arial" w:ascii="Arial" w:hAnsi="Arial"/>
+          <w:sz w:val="24"/>
+          <w:szCs w:val="24"/>
+        </w:rPr>
+        <w:t xml:space="preserve">, </w:t>
+      </w:r>
+      <w:r>
+        <w:rPr>
+          <w:rFonts w:eastAsia="Arial" w:cs="Arial" w:ascii="Arial" w:hAnsi="Arial"/>
+          <w:sz w:val="24"/>
+          <w:szCs w:val="24"/>
+          <w:shd w:fill="auto" w:val="clear"/>
+        </w:rPr>
+        <w:t>con el fin de adaptarlo a la tarea de</w:t>
+      </w:r>
+      <w:r>
+        <w:rPr>
+          <w:rFonts w:eastAsia="Arial" w:cs="Arial" w:ascii="Arial" w:hAnsi="Arial"/>
+          <w:sz w:val="24"/>
+          <w:szCs w:val="24"/>
+        </w:rPr>
+        <w:t xml:space="preserve"> clasificación </w:t>
+      </w:r>
+      <w:r>
+        <w:rPr>
+          <w:rFonts w:eastAsia="Arial" w:cs="Arial" w:ascii="Arial" w:hAnsi="Arial"/>
+          <w:sz w:val="24"/>
+          <w:szCs w:val="24"/>
+        </w:rPr>
+        <w:t>binaria entre</w:t>
+      </w:r>
+      <w:r>
+        <w:rPr>
+          <w:rFonts w:eastAsia="Arial" w:cs="Arial" w:ascii="Arial" w:hAnsi="Arial"/>
+          <w:sz w:val="24"/>
+          <w:szCs w:val="24"/>
+        </w:rPr>
+        <w:t xml:space="preserve"> pacientes con la enfermedad de Alzheimer y sujetos de control</w:t>
+      </w:r>
+      <w:r>
+        <w:rPr>
+          <w:rFonts w:eastAsia="Arial" w:cs="Arial" w:ascii="Arial" w:hAnsi="Arial"/>
+          <w:sz w:val="24"/>
+          <w:szCs w:val="24"/>
+        </w:rPr>
+        <w:t>.</w:t>
+      </w:r>
+    </w:p>
+    <w:p>
+      <w:pPr>
+        <w:pStyle w:val="normal1"/>
+        <w:numPr>
+          <w:ilvl w:val="0"/>
+          <w:numId w:val="0"/>
+        </w:numPr>
+        <w:spacing w:lineRule="auto" w:line="240" w:before="240" w:afterAutospacing="0" w:after="0"/>
+        <w:ind w:hanging="0" w:left="720"/>
+        <w:rPr>
+          <w:rFonts w:ascii="Arial" w:hAnsi="Arial"/>
+        </w:rPr>
+      </w:pPr>
+      <w:r>
+        <w:rPr>
+          <w:rFonts w:ascii="Arial" w:hAnsi="Arial"/>
         </w:rPr>
       </w:r>
     </w:p>
@@ -2604,145 +2640,207 @@
         <w:ind w:hanging="360" w:left="720"/>
         <w:rPr>
           <w:rFonts w:ascii="Arial" w:hAnsi="Arial"/>
-          <w:sz w:val="24"/>
-          <w:szCs w:val="24"/>
-        </w:rPr>
-      </w:pPr>
-      <w:r>
-        <w:rPr>
-          <w:rFonts w:eastAsia="Arial" w:cs="Arial" w:ascii="Arial" w:hAnsi="Arial"/>
-          <w:sz w:val="24"/>
-          <w:szCs w:val="24"/>
-        </w:rPr>
-        <w:t xml:space="preserve">Comparar el </w:t>
-      </w:r>
-      <w:r>
-        <w:rPr>
-          <w:rFonts w:eastAsia="Arial" w:cs="Arial" w:ascii="Arial" w:hAnsi="Arial"/>
-          <w:sz w:val="24"/>
-          <w:szCs w:val="24"/>
-        </w:rPr>
-        <w:t>rendimiento</w:t>
-      </w:r>
-      <w:r>
-        <w:rPr>
-          <w:rFonts w:eastAsia="Arial" w:cs="Arial" w:ascii="Arial" w:hAnsi="Arial"/>
-          <w:sz w:val="24"/>
-          <w:szCs w:val="24"/>
-        </w:rPr>
-        <w:t xml:space="preserve"> en </w:t>
-      </w:r>
-      <w:r>
-        <w:rPr>
-          <w:rFonts w:eastAsia="Arial" w:cs="Arial" w:ascii="Arial" w:hAnsi="Arial"/>
-          <w:sz w:val="24"/>
-          <w:szCs w:val="24"/>
-        </w:rPr>
-        <w:t>des</w:t>
-      </w:r>
-      <w:r>
-        <w:rPr>
-          <w:rFonts w:eastAsia="Arial" w:cs="Arial" w:ascii="Arial" w:hAnsi="Arial"/>
-          <w:sz w:val="24"/>
-          <w:szCs w:val="24"/>
-        </w:rPr>
-        <w:t>e</w:t>
-      </w:r>
-      <w:r>
-        <w:rPr>
-          <w:rFonts w:eastAsia="Arial" w:cs="Arial" w:ascii="Arial" w:hAnsi="Arial"/>
-          <w:sz w:val="24"/>
-          <w:szCs w:val="24"/>
-        </w:rPr>
-        <w:t>mpeño</w:t>
-      </w:r>
-      <w:r>
-        <w:rPr>
-          <w:rFonts w:eastAsia="Arial" w:cs="Arial" w:ascii="Arial" w:hAnsi="Arial"/>
-          <w:sz w:val="24"/>
-          <w:szCs w:val="24"/>
-        </w:rPr>
-        <w:t xml:space="preserve"> y tiempo </w:t>
-      </w:r>
-      <w:r>
-        <w:rPr>
-          <w:rFonts w:eastAsia="Arial" w:cs="Arial" w:ascii="Arial" w:hAnsi="Arial"/>
-          <w:sz w:val="24"/>
-          <w:szCs w:val="24"/>
-        </w:rPr>
-        <w:t xml:space="preserve">de ejecución </w:t>
-      </w:r>
-      <w:r>
-        <w:rPr>
-          <w:rFonts w:eastAsia="Arial" w:cs="Arial" w:ascii="Arial" w:hAnsi="Arial"/>
-          <w:sz w:val="24"/>
-          <w:szCs w:val="24"/>
-        </w:rPr>
-        <w:t xml:space="preserve">requerido de las estrategias evaluadas frente al modelo </w:t>
-      </w:r>
-      <w:r>
-        <w:rPr>
-          <w:rFonts w:eastAsia="Arial" w:cs="Arial" w:ascii="Arial" w:hAnsi="Arial"/>
-          <w:sz w:val="24"/>
-          <w:szCs w:val="24"/>
-        </w:rPr>
-        <w:t>no ajustado</w:t>
-      </w:r>
-      <w:r>
-        <w:rPr>
-          <w:rFonts w:eastAsia="Arial" w:cs="Arial" w:ascii="Arial" w:hAnsi="Arial"/>
-          <w:sz w:val="24"/>
-          <w:szCs w:val="24"/>
-        </w:rPr>
-        <w:t xml:space="preserve">, para determinar si </w:t>
-      </w:r>
-      <w:r>
-        <w:rPr>
-          <w:rFonts w:eastAsia="Arial" w:cs="Arial" w:ascii="Arial" w:hAnsi="Arial"/>
-          <w:sz w:val="24"/>
-          <w:szCs w:val="24"/>
-        </w:rPr>
-        <w:t xml:space="preserve">las estrategias implementadas </w:t>
-      </w:r>
-      <w:r>
-        <w:rPr>
-          <w:rFonts w:eastAsia="Arial" w:cs="Arial" w:ascii="Arial" w:hAnsi="Arial"/>
-          <w:sz w:val="24"/>
-          <w:szCs w:val="24"/>
-        </w:rPr>
-        <w:t>constituye</w:t>
-      </w:r>
-      <w:r>
-        <w:rPr>
-          <w:rFonts w:eastAsia="Arial" w:cs="Arial" w:ascii="Arial" w:hAnsi="Arial"/>
-          <w:sz w:val="24"/>
-          <w:szCs w:val="24"/>
-        </w:rPr>
-        <w:t>n</w:t>
-      </w:r>
-      <w:r>
-        <w:rPr>
-          <w:rFonts w:eastAsia="Arial" w:cs="Arial" w:ascii="Arial" w:hAnsi="Arial"/>
-          <w:sz w:val="24"/>
-          <w:szCs w:val="24"/>
-        </w:rPr>
-        <w:t xml:space="preserve"> una alternativa viable </w:t>
-      </w:r>
-      <w:r>
-        <w:rPr>
-          <w:rFonts w:eastAsia="Arial" w:cs="Arial" w:ascii="Arial" w:hAnsi="Arial"/>
-          <w:sz w:val="24"/>
-          <w:szCs w:val="24"/>
-        </w:rPr>
-        <w:t xml:space="preserve">para la clasificación de Alzheimer </w:t>
-      </w:r>
-      <w:r>
-        <w:rPr>
-          <w:rFonts w:eastAsia="Arial" w:cs="Arial" w:ascii="Arial" w:hAnsi="Arial"/>
-          <w:sz w:val="24"/>
-          <w:szCs w:val="24"/>
-        </w:rPr>
-        <w:t>en condiciones de datos limitados.</w:t>
+        </w:rPr>
+      </w:pPr>
+      <w:r>
+        <w:rPr>
+          <w:rFonts w:eastAsia="Arial" w:cs="Arial" w:ascii="Arial" w:hAnsi="Arial"/>
+          <w:sz w:val="24"/>
+          <w:szCs w:val="24"/>
+        </w:rPr>
+        <w:t>Evaluar y comparar</w:t>
+      </w:r>
+      <w:r>
+        <w:rPr>
+          <w:rFonts w:eastAsia="Arial" w:cs="Arial" w:ascii="Arial" w:hAnsi="Arial"/>
+          <w:sz w:val="24"/>
+          <w:szCs w:val="24"/>
+        </w:rPr>
+        <w:t xml:space="preserve"> </w:t>
+      </w:r>
+      <w:r>
+        <w:rPr>
+          <w:rFonts w:eastAsia="Arial" w:cs="Arial" w:ascii="Arial" w:hAnsi="Arial"/>
+          <w:sz w:val="24"/>
+          <w:szCs w:val="24"/>
+        </w:rPr>
+        <w:t xml:space="preserve">el desempeño </w:t>
+      </w:r>
+      <w:r>
+        <w:rPr>
+          <w:rFonts w:eastAsia="Arial" w:cs="Arial" w:ascii="Arial" w:hAnsi="Arial"/>
+          <w:sz w:val="24"/>
+          <w:szCs w:val="24"/>
+        </w:rPr>
+        <w:t>de clasificació</w:t>
+      </w:r>
+      <w:r>
+        <w:rPr>
+          <w:rFonts w:eastAsia="Arial" w:cs="Arial" w:ascii="Arial" w:hAnsi="Arial"/>
+          <w:sz w:val="24"/>
+          <w:szCs w:val="24"/>
+        </w:rPr>
+        <w:t>n, el tiempo de entranamiento, e</w:t>
+      </w:r>
+      <w:r>
+        <w:rPr>
+          <w:rFonts w:eastAsia="Arial" w:cs="Arial" w:ascii="Arial" w:hAnsi="Arial"/>
+          <w:sz w:val="24"/>
+          <w:szCs w:val="24"/>
+        </w:rPr>
+        <w:t>l tiempo de</w:t>
+      </w:r>
+      <w:r>
+        <w:rPr>
+          <w:rFonts w:eastAsia="Arial" w:cs="Arial" w:ascii="Arial" w:hAnsi="Arial"/>
+          <w:sz w:val="24"/>
+          <w:szCs w:val="24"/>
+        </w:rPr>
+        <w:t xml:space="preserve"> inferencia </w:t>
+      </w:r>
+      <w:r>
+        <w:rPr>
+          <w:rFonts w:eastAsia="Arial" w:cs="Arial" w:ascii="Arial" w:hAnsi="Arial"/>
+          <w:sz w:val="24"/>
+          <w:szCs w:val="24"/>
+        </w:rPr>
+        <w:t>y el numero de parametros entrenables</w:t>
+      </w:r>
+      <w:r>
+        <w:rPr>
+          <w:rFonts w:eastAsia="Arial" w:cs="Arial" w:ascii="Arial" w:hAnsi="Arial"/>
+          <w:sz w:val="24"/>
+          <w:szCs w:val="24"/>
+        </w:rPr>
+        <w:t xml:space="preserve"> </w:t>
+      </w:r>
+      <w:r>
+        <w:rPr>
+          <w:rFonts w:eastAsia="Arial" w:cs="Arial" w:ascii="Arial" w:hAnsi="Arial"/>
+          <w:sz w:val="24"/>
+          <w:szCs w:val="24"/>
+        </w:rPr>
+        <w:t>entre</w:t>
+      </w:r>
+      <w:r>
+        <w:rPr>
+          <w:rFonts w:eastAsia="Arial" w:cs="Arial" w:ascii="Arial" w:hAnsi="Arial"/>
+          <w:sz w:val="24"/>
+          <w:szCs w:val="24"/>
+        </w:rPr>
+        <w:t xml:space="preserve"> </w:t>
+      </w:r>
+      <w:r>
+        <w:rPr>
+          <w:rFonts w:eastAsia="Arial" w:cs="Arial" w:ascii="Arial" w:hAnsi="Arial"/>
+          <w:sz w:val="24"/>
+          <w:szCs w:val="24"/>
+        </w:rPr>
+        <w:t>el</w:t>
+      </w:r>
+      <w:r>
+        <w:rPr>
+          <w:rFonts w:eastAsia="Arial" w:cs="Arial" w:ascii="Arial" w:hAnsi="Arial"/>
+          <w:sz w:val="24"/>
+          <w:szCs w:val="24"/>
+        </w:rPr>
+        <w:t xml:space="preserve"> enfoque </w:t>
+      </w:r>
+      <w:r>
+        <w:rPr>
+          <w:rFonts w:eastAsia="Arial" w:cs="Arial" w:ascii="Arial" w:hAnsi="Arial"/>
+          <w:sz w:val="24"/>
+          <w:szCs w:val="24"/>
+        </w:rPr>
+        <w:t>del modelo</w:t>
+      </w:r>
+      <w:r>
+        <w:rPr>
+          <w:rFonts w:eastAsia="Arial" w:cs="Arial" w:ascii="Arial" w:hAnsi="Arial"/>
+          <w:sz w:val="24"/>
+          <w:szCs w:val="24"/>
+        </w:rPr>
+        <w:t xml:space="preserve"> </w:t>
+      </w:r>
+      <w:r>
+        <w:rPr>
+          <w:rFonts w:eastAsia="Arial" w:cs="Arial" w:ascii="Arial" w:hAnsi="Arial"/>
+          <w:sz w:val="24"/>
+          <w:szCs w:val="24"/>
+        </w:rPr>
+        <w:t>base</w:t>
+      </w:r>
+      <w:r>
+        <w:rPr>
+          <w:rFonts w:eastAsia="Arial" w:cs="Arial" w:ascii="Arial" w:hAnsi="Arial"/>
+          <w:sz w:val="24"/>
+          <w:szCs w:val="24"/>
+        </w:rPr>
+        <w:t xml:space="preserve"> y </w:t>
+      </w:r>
+      <w:r>
+        <w:rPr>
+          <w:rFonts w:eastAsia="Arial" w:cs="Arial" w:ascii="Arial" w:hAnsi="Arial"/>
+          <w:sz w:val="24"/>
+          <w:szCs w:val="24"/>
+        </w:rPr>
+        <w:t xml:space="preserve">las estrategias </w:t>
+      </w:r>
+      <w:r>
+        <w:rPr>
+          <w:rFonts w:eastAsia="Arial" w:cs="Arial" w:ascii="Arial" w:hAnsi="Arial"/>
+          <w:sz w:val="24"/>
+          <w:szCs w:val="24"/>
+        </w:rPr>
+        <w:t xml:space="preserve">de ajuste </w:t>
+      </w:r>
+      <w:r>
+        <w:rPr>
+          <w:rFonts w:eastAsia="Arial" w:cs="Arial" w:ascii="Arial" w:hAnsi="Arial"/>
+          <w:sz w:val="24"/>
+          <w:szCs w:val="24"/>
+        </w:rPr>
+        <w:t>implementadas</w:t>
+      </w:r>
+      <w:r>
+        <w:rPr>
+          <w:rFonts w:eastAsia="Arial" w:cs="Arial" w:ascii="Arial" w:hAnsi="Arial"/>
+          <w:sz w:val="24"/>
+          <w:szCs w:val="24"/>
+        </w:rPr>
+        <w:t xml:space="preserve"> </w:t>
+      </w:r>
+      <w:r>
+        <w:rPr>
+          <w:rFonts w:eastAsia="Arial" w:cs="Arial" w:ascii="Arial" w:hAnsi="Arial"/>
+          <w:sz w:val="24"/>
+          <w:szCs w:val="24"/>
+        </w:rPr>
+        <w:t>para</w:t>
+      </w:r>
+      <w:r>
+        <w:rPr>
+          <w:rFonts w:eastAsia="Arial" w:cs="Arial" w:ascii="Arial" w:hAnsi="Arial"/>
+          <w:sz w:val="24"/>
+          <w:szCs w:val="24"/>
+        </w:rPr>
+        <w:t xml:space="preserve"> </w:t>
+      </w:r>
+      <w:r>
+        <w:rPr>
+          <w:rFonts w:eastAsia="Arial" w:cs="Arial" w:ascii="Arial" w:hAnsi="Arial"/>
+          <w:sz w:val="24"/>
+          <w:szCs w:val="24"/>
+        </w:rPr>
+        <w:t>la clasificación entre pacientes con enfermedad de Alzheimer y sujetos de control</w:t>
+      </w:r>
+      <w:r>
+        <w:rPr>
+          <w:rFonts w:eastAsia="Arial" w:cs="Arial" w:ascii="Arial" w:hAnsi="Arial"/>
+          <w:sz w:val="24"/>
+          <w:szCs w:val="24"/>
+        </w:rPr>
+        <w:t>.</w:t>
       </w:r>
     </w:p>
     <w:p>
@@ -2777,8 +2875,6 @@
         <w:jc w:val="both"/>
         <w:rPr>
           <w:rFonts w:ascii="Arial" w:hAnsi="Arial"/>
-          <w:sz w:val="24"/>
-          <w:szCs w:val="24"/>
         </w:rPr>
       </w:pPr>
       <w:r>
@@ -2802,8 +2898,6 @@
         <w:jc w:val="both"/>
         <w:rPr>
           <w:rFonts w:ascii="Arial" w:hAnsi="Arial"/>
-          <w:sz w:val="24"/>
-          <w:szCs w:val="24"/>
         </w:rPr>
       </w:pPr>
       <w:r>
@@ -2824,33 +2918,15 @@
         <w:jc w:val="both"/>
         <w:rPr>
           <w:rFonts w:ascii="Arial" w:hAnsi="Arial"/>
-          <w:sz w:val="24"/>
-          <w:szCs w:val="24"/>
-        </w:rPr>
-      </w:pPr>
-      <w:r>
-        <w:rPr>
-          <w:rFonts w:eastAsia="Arial" w:cs="Arial" w:ascii="Arial" w:hAnsi="Arial"/>
-          <w:sz w:val="24"/>
-          <w:szCs w:val="24"/>
-        </w:rPr>
-        <w:t xml:space="preserve">wav2vec 2.0 </w:t>
-      </w:r>
-      <w:r>
-        <w:rPr>
-          <w:rFonts w:eastAsia="Arial" w:cs="Arial" w:ascii="Arial" w:hAnsi="Arial"/>
-          <w:sz w:val="24"/>
-          <w:szCs w:val="24"/>
-        </w:rPr>
-        <w:t>[6]</w:t>
-      </w:r>
-      <w:r>
-        <w:rPr>
-          <w:rFonts w:eastAsia="Arial" w:cs="Arial" w:ascii="Arial" w:hAnsi="Arial"/>
-          <w:sz w:val="24"/>
-          <w:szCs w:val="24"/>
-        </w:rPr>
-        <w:t xml:space="preserve"> es un modelo de aprendizaje auto-supervisado que aprende representaciones de habla directamente a partir de audio crudo, sin necesidad de transcripciones. Su arquitectura se compone de tres bloques: un codificador convolucional (</w:t>
+        </w:rPr>
+      </w:pPr>
+      <w:r>
+        <w:rPr>
+          <w:rFonts w:eastAsia="Arial" w:cs="Arial" w:ascii="Arial" w:hAnsi="Arial"/>
+          <w:sz w:val="24"/>
+          <w:szCs w:val="24"/>
+        </w:rPr>
+        <w:t>wav2vec 2.0 [6] es un modelo de aprendizaje auto-supervisado que aprende representaciones de habla directamente a partir de audio crudo, sin necesidad de transcripciones. Su arquitectura se compone de tres bloques: un codificador convolucional (</w:t>
       </w:r>
       <w:r>
         <w:rPr>
@@ -2878,8 +2954,6 @@
         <w:jc w:val="both"/>
         <w:rPr>
           <w:rFonts w:ascii="Arial" w:hAnsi="Arial"/>
-          <w:sz w:val="24"/>
-          <w:szCs w:val="24"/>
         </w:rPr>
       </w:pPr>
       <w:r>
@@ -2911,8 +2985,6 @@
       <w:r>
         <w:rPr>
           <w:rFonts w:ascii="Arial" w:hAnsi="Arial"/>
-          <w:sz w:val="24"/>
-          <w:szCs w:val="24"/>
         </w:rPr>
       </w:r>
       <m:oMath xmlns:m="http://schemas.openxmlformats.org/officeDocument/2006/math">
@@ -2982,8 +3054,6 @@
       <w:r>
         <w:rPr>
           <w:rFonts w:ascii="Arial" w:hAnsi="Arial"/>
-          <w:sz w:val="24"/>
-          <w:szCs w:val="24"/>
         </w:rPr>
       </w:r>
       <m:oMath xmlns:m="http://schemas.openxmlformats.org/officeDocument/2006/math">
@@ -3005,8 +3075,6 @@
       <w:r>
         <w:rPr>
           <w:rFonts w:ascii="Arial" w:hAnsi="Arial"/>
-          <w:sz w:val="24"/>
-          <w:szCs w:val="24"/>
         </w:rPr>
       </w:r>
       <m:oMath xmlns:m="http://schemas.openxmlformats.org/officeDocument/2006/math">
@@ -3063,23 +3131,7 @@
           <w:sz w:val="24"/>
           <w:szCs w:val="24"/>
         </w:rPr>
-        <w:t xml:space="preserve">). Por el solapamiento entre tramos, el resultado es que cerca del 49% de la secuencia queda enmascarada. Esta estrategia de bloques (en vez de fotogramas aislados) sigue una lógica similar a SpecAugment </w:t>
-      </w:r>
-      <w:r>
-        <w:rPr>
-          <w:rFonts w:eastAsia="Arial" w:cs="Arial" w:ascii="Arial" w:hAnsi="Arial"/>
-          <w:sz w:val="24"/>
-          <w:szCs w:val="24"/>
-        </w:rPr>
-        <w:t>[12]</w:t>
-      </w:r>
-      <w:r>
-        <w:rPr>
-          <w:rFonts w:eastAsia="Arial" w:cs="Arial" w:ascii="Arial" w:hAnsi="Arial"/>
-          <w:sz w:val="24"/>
-          <w:szCs w:val="24"/>
-        </w:rPr>
-        <w:t>: los fotogramas vecinos están altamente correlacionados, de modo que tapar uno solo permitiría reconstruirlo por simple interpolación, mientras que cubrir un tramo completo obliga al modelo a recurrir a contexto de largo alcance.</w:t>
+        <w:t>). Por el solapamiento entre tramos, el resultado es que cerca del 49% de la secuencia queda enmascarada. Esta estrategia de bloques (en vez de fotogramas aislados) sigue una lógica similar a SpecAugment [12]: los fotogramas vecinos están altamente correlacionados, de modo que tapar uno solo permitiría reconstruirlo por simple interpolación, mientras que cubrir un tramo completo obliga al modelo a recurrir a contexto de largo alcance.</w:t>
       </w:r>
     </w:p>
     <w:p>
@@ -3089,8 +3141,6 @@
         <w:jc w:val="both"/>
         <w:rPr>
           <w:rFonts w:ascii="Arial" w:hAnsi="Arial"/>
-          <w:sz w:val="24"/>
-          <w:szCs w:val="24"/>
         </w:rPr>
       </w:pPr>
       <w:r>
@@ -3104,8 +3154,6 @@
       <w:r>
         <w:rPr>
           <w:rFonts w:ascii="Arial" w:hAnsi="Arial"/>
-          <w:sz w:val="24"/>
-          <w:szCs w:val="24"/>
         </w:rPr>
       </w:r>
       <m:oMath xmlns:m="http://schemas.openxmlformats.org/officeDocument/2006/math">
@@ -3175,8 +3223,6 @@
       <w:r>
         <w:rPr>
           <w:rFonts w:ascii="Arial" w:hAnsi="Arial"/>
-          <w:sz w:val="24"/>
-          <w:szCs w:val="24"/>
         </w:rPr>
       </w:r>
       <m:oMath xmlns:m="http://schemas.openxmlformats.org/officeDocument/2006/math">
@@ -3264,8 +3310,6 @@
       <w:r>
         <w:rPr>
           <w:rFonts w:ascii="Arial" w:hAnsi="Arial"/>
-          <w:sz w:val="24"/>
-          <w:szCs w:val="24"/>
         </w:rPr>
       </w:r>
       <m:oMath xmlns:m="http://schemas.openxmlformats.org/officeDocument/2006/math">
@@ -3304,8 +3348,6 @@
         <w:jc w:val="both"/>
         <w:rPr>
           <w:rFonts w:ascii="Arial" w:hAnsi="Arial"/>
-          <w:sz w:val="24"/>
-          <w:szCs w:val="24"/>
         </w:rPr>
       </w:pPr>
       <w:r>
@@ -3319,8 +3361,6 @@
       <w:r>
         <w:rPr>
           <w:rFonts w:ascii="Arial" w:hAnsi="Arial"/>
-          <w:sz w:val="24"/>
-          <w:szCs w:val="24"/>
         </w:rPr>
       </w:r>
       <m:oMath xmlns:m="http://schemas.openxmlformats.org/officeDocument/2006/math">
@@ -3360,8 +3400,6 @@
       <w:r>
         <w:rPr>
           <w:rFonts w:ascii="Arial" w:hAnsi="Arial"/>
-          <w:sz w:val="24"/>
-          <w:szCs w:val="24"/>
         </w:rPr>
       </w:r>
       <m:oMath xmlns:m="http://schemas.openxmlformats.org/officeDocument/2006/math">
@@ -3383,8 +3421,6 @@
       <w:r>
         <w:rPr>
           <w:rFonts w:ascii="Arial" w:hAnsi="Arial"/>
-          <w:sz w:val="24"/>
-          <w:szCs w:val="24"/>
         </w:rPr>
       </w:r>
       <m:oMath xmlns:m="http://schemas.openxmlformats.org/officeDocument/2006/math">
@@ -3478,8 +3514,6 @@
       <w:r>
         <w:rPr>
           <w:rFonts w:ascii="Arial" w:hAnsi="Arial"/>
-          <w:sz w:val="24"/>
-          <w:szCs w:val="24"/>
         </w:rPr>
       </w:r>
       <m:oMath xmlns:m="http://schemas.openxmlformats.org/officeDocument/2006/math">
@@ -3525,8 +3559,6 @@
       <w:r>
         <w:rPr>
           <w:rFonts w:ascii="Arial" w:hAnsi="Arial"/>
-          <w:sz w:val="24"/>
-          <w:szCs w:val="24"/>
         </w:rPr>
       </w:r>
       <m:oMath xmlns:m="http://schemas.openxmlformats.org/officeDocument/2006/math">
@@ -3595,8 +3627,6 @@
         <w:jc w:val="both"/>
         <w:rPr>
           <w:rFonts w:ascii="Arial" w:hAnsi="Arial"/>
-          <w:sz w:val="24"/>
-          <w:szCs w:val="24"/>
         </w:rPr>
       </w:pPr>
       <w:r>
@@ -3646,8 +3676,6 @@
       <w:r>
         <w:rPr>
           <w:rFonts w:ascii="Arial" w:hAnsi="Arial"/>
-          <w:sz w:val="24"/>
-          <w:szCs w:val="24"/>
         </w:rPr>
       </w:r>
       <m:oMath xmlns:m="http://schemas.openxmlformats.org/officeDocument/2006/math">
@@ -3693,8 +3721,6 @@
       <w:r>
         <w:rPr>
           <w:rFonts w:ascii="Arial" w:hAnsi="Arial"/>
-          <w:sz w:val="24"/>
-          <w:szCs w:val="24"/>
         </w:rPr>
       </w:r>
       <m:oMath xmlns:m="http://schemas.openxmlformats.org/officeDocument/2006/math">
@@ -3746,8 +3772,6 @@
       <w:r>
         <w:rPr>
           <w:rFonts w:ascii="Arial" w:hAnsi="Arial"/>
-          <w:sz w:val="24"/>
-          <w:szCs w:val="24"/>
         </w:rPr>
       </w:r>
       <m:oMath xmlns:m="http://schemas.openxmlformats.org/officeDocument/2006/math">
@@ -3799,8 +3823,6 @@
       <w:r>
         <w:rPr>
           <w:rFonts w:ascii="Arial" w:hAnsi="Arial"/>
-          <w:sz w:val="24"/>
-          <w:szCs w:val="24"/>
         </w:rPr>
       </w:r>
       <m:oMath xmlns:m="http://schemas.openxmlformats.org/officeDocument/2006/math">
@@ -3845,15 +3867,11 @@
         <w:jc w:val="center"/>
         <w:rPr>
           <w:rFonts w:ascii="Arial" w:hAnsi="Arial"/>
-          <w:sz w:val="24"/>
-          <w:szCs w:val="24"/>
-        </w:rPr>
-      </w:pPr>
-      <w:r>
-        <w:rPr>
-          <w:rFonts w:ascii="Arial" w:hAnsi="Arial"/>
-          <w:sz w:val="24"/>
-          <w:szCs w:val="24"/>
+        </w:rPr>
+      </w:pPr>
+      <w:r>
+        <w:rPr>
+          <w:rFonts w:ascii="Arial" w:hAnsi="Arial"/>
         </w:rPr>
       </w:r>
       <m:oMathPara xmlns:m="http://schemas.openxmlformats.org/officeDocument/2006/math">
@@ -4146,8 +4164,6 @@
         <w:jc w:val="both"/>
         <w:rPr>
           <w:rFonts w:ascii="Arial" w:hAnsi="Arial"/>
-          <w:sz w:val="24"/>
-          <w:szCs w:val="24"/>
         </w:rPr>
       </w:pPr>
       <w:r>
@@ -4215,8 +4231,6 @@
       <w:r>
         <w:rPr>
           <w:rFonts w:ascii="Arial" w:hAnsi="Arial"/>
-          <w:sz w:val="24"/>
-          <w:szCs w:val="24"/>
         </w:rPr>
       </w:r>
       <m:oMath xmlns:m="http://schemas.openxmlformats.org/officeDocument/2006/math">
@@ -4274,8 +4288,6 @@
       <w:r>
         <w:rPr>
           <w:rFonts w:ascii="Arial" w:hAnsi="Arial"/>
-          <w:sz w:val="24"/>
-          <w:szCs w:val="24"/>
         </w:rPr>
       </w:r>
       <m:oMath xmlns:m="http://schemas.openxmlformats.org/officeDocument/2006/math">
@@ -4302,8 +4314,6 @@
         <w:jc w:val="both"/>
         <w:rPr>
           <w:rFonts w:ascii="Arial" w:hAnsi="Arial"/>
-          <w:sz w:val="24"/>
-          <w:szCs w:val="24"/>
         </w:rPr>
       </w:pPr>
       <w:r>
@@ -4317,8 +4327,6 @@
       <w:r>
         <w:rPr>
           <w:rFonts w:ascii="Arial" w:hAnsi="Arial"/>
-          <w:sz w:val="24"/>
-          <w:szCs w:val="24"/>
         </w:rPr>
       </w:r>
       <m:oMath xmlns:m="http://schemas.openxmlformats.org/officeDocument/2006/math">
@@ -4352,8 +4360,6 @@
       <w:r>
         <w:rPr>
           <w:rFonts w:ascii="Arial" w:hAnsi="Arial"/>
-          <w:sz w:val="24"/>
-          <w:szCs w:val="24"/>
         </w:rPr>
       </w:r>
       <m:oMath xmlns:m="http://schemas.openxmlformats.org/officeDocument/2006/math">
@@ -4387,8 +4393,6 @@
       <w:r>
         <w:rPr>
           <w:rFonts w:ascii="Arial" w:hAnsi="Arial"/>
-          <w:sz w:val="24"/>
-          <w:szCs w:val="24"/>
         </w:rPr>
       </w:r>
       <m:oMath xmlns:m="http://schemas.openxmlformats.org/officeDocument/2006/math">
@@ -4422,8 +4426,6 @@
       <w:r>
         <w:rPr>
           <w:rFonts w:ascii="Arial" w:hAnsi="Arial"/>
-          <w:sz w:val="24"/>
-          <w:szCs w:val="24"/>
         </w:rPr>
       </w:r>
       <m:oMath xmlns:m="http://schemas.openxmlformats.org/officeDocument/2006/math">
@@ -4457,8 +4459,6 @@
       <w:r>
         <w:rPr>
           <w:rFonts w:ascii="Arial" w:hAnsi="Arial"/>
-          <w:sz w:val="24"/>
-          <w:szCs w:val="24"/>
         </w:rPr>
       </w:r>
       <m:oMath xmlns:m="http://schemas.openxmlformats.org/officeDocument/2006/math">
@@ -4480,8 +4480,6 @@
       <w:r>
         <w:rPr>
           <w:rFonts w:ascii="Arial" w:hAnsi="Arial"/>
-          <w:sz w:val="24"/>
-          <w:szCs w:val="24"/>
         </w:rPr>
       </w:r>
       <m:oMath xmlns:m="http://schemas.openxmlformats.org/officeDocument/2006/math">
@@ -4508,15 +4506,11 @@
         <w:jc w:val="center"/>
         <w:rPr>
           <w:rFonts w:ascii="Arial" w:hAnsi="Arial"/>
-          <w:sz w:val="24"/>
-          <w:szCs w:val="24"/>
-        </w:rPr>
-      </w:pPr>
-      <w:r>
-        <w:rPr>
-          <w:rFonts w:ascii="Arial" w:hAnsi="Arial"/>
-          <w:sz w:val="24"/>
-          <w:szCs w:val="24"/>
+        </w:rPr>
+      </w:pPr>
+      <w:r>
+        <w:rPr>
+          <w:rFonts w:ascii="Arial" w:hAnsi="Arial"/>
         </w:rPr>
       </w:r>
       <m:oMath xmlns:m="http://schemas.openxmlformats.org/officeDocument/2006/math">
@@ -4795,8 +4789,6 @@
         <w:jc w:val="both"/>
         <w:rPr>
           <w:rFonts w:ascii="Arial" w:hAnsi="Arial"/>
-          <w:sz w:val="24"/>
-          <w:szCs w:val="24"/>
         </w:rPr>
       </w:pPr>
       <w:r>
@@ -4810,8 +4802,6 @@
       <w:r>
         <w:rPr>
           <w:rFonts w:ascii="Arial" w:hAnsi="Arial"/>
-          <w:sz w:val="24"/>
-          <w:szCs w:val="24"/>
         </w:rPr>
       </w:r>
       <m:oMath xmlns:m="http://schemas.openxmlformats.org/officeDocument/2006/math">
@@ -4886,15 +4876,11 @@
         <w:jc w:val="center"/>
         <w:rPr>
           <w:rFonts w:ascii="Arial" w:hAnsi="Arial"/>
-          <w:sz w:val="24"/>
-          <w:szCs w:val="24"/>
-        </w:rPr>
-      </w:pPr>
-      <w:r>
-        <w:rPr>
-          <w:rFonts w:ascii="Arial" w:hAnsi="Arial"/>
-          <w:sz w:val="24"/>
-          <w:szCs w:val="24"/>
+        </w:rPr>
+      </w:pPr>
+      <w:r>
+        <w:rPr>
+          <w:rFonts w:ascii="Arial" w:hAnsi="Arial"/>
         </w:rPr>
       </w:r>
       <m:oMathPara xmlns:m="http://schemas.openxmlformats.org/officeDocument/2006/math">
@@ -5104,8 +5090,6 @@
         <w:jc w:val="left"/>
         <w:rPr>
           <w:rFonts w:ascii="Arial" w:hAnsi="Arial"/>
-          <w:sz w:val="24"/>
-          <w:szCs w:val="24"/>
         </w:rPr>
       </w:pPr>
       <w:r>
@@ -5119,8 +5103,6 @@
       <w:r>
         <w:rPr>
           <w:rFonts w:ascii="Arial" w:hAnsi="Arial"/>
-          <w:sz w:val="24"/>
-          <w:szCs w:val="24"/>
         </w:rPr>
       </w:r>
       <m:oMath xmlns:m="http://schemas.openxmlformats.org/officeDocument/2006/math">
@@ -5179,8 +5161,6 @@
       <w:r>
         <w:rPr>
           <w:rFonts w:ascii="Arial" w:hAnsi="Arial"/>
-          <w:sz w:val="24"/>
-          <w:szCs w:val="24"/>
         </w:rPr>
       </w:r>
       <m:oMath xmlns:m="http://schemas.openxmlformats.org/officeDocument/2006/math">
@@ -5244,8 +5224,6 @@
       <w:r>
         <w:rPr>
           <w:rFonts w:ascii="Arial" w:hAnsi="Arial"/>
-          <w:sz w:val="24"/>
-          <w:szCs w:val="24"/>
         </w:rPr>
       </w:r>
       <m:oMath xmlns:m="http://schemas.openxmlformats.org/officeDocument/2006/math">
@@ -5272,8 +5250,6 @@
         <w:jc w:val="left"/>
         <w:rPr>
           <w:rFonts w:ascii="Arial" w:hAnsi="Arial"/>
-          <w:sz w:val="24"/>
-          <w:szCs w:val="24"/>
         </w:rPr>
       </w:pPr>
       <w:r>
@@ -5294,8 +5270,6 @@
         <w:jc w:val="left"/>
         <w:rPr>
           <w:rFonts w:ascii="Arial" w:hAnsi="Arial"/>
-          <w:sz w:val="24"/>
-          <w:szCs w:val="24"/>
         </w:rPr>
       </w:pPr>
       <w:r>
@@ -5327,8 +5301,6 @@
       <w:r>
         <w:rPr>
           <w:rFonts w:ascii="Arial" w:hAnsi="Arial"/>
-          <w:sz w:val="24"/>
-          <w:szCs w:val="24"/>
         </w:rPr>
       </w:r>
       <m:oMath xmlns:m="http://schemas.openxmlformats.org/officeDocument/2006/math">
@@ -5385,8 +5357,6 @@
         <w:jc w:val="center"/>
         <w:rPr>
           <w:rFonts w:ascii="Arial" w:hAnsi="Arial"/>
-          <w:sz w:val="24"/>
-          <w:szCs w:val="24"/>
         </w:rPr>
       </w:pPr>
       <w:r>
@@ -5400,8 +5370,6 @@
       <w:r>
         <w:rPr>
           <w:rFonts w:ascii="Arial" w:hAnsi="Arial"/>
-          <w:sz w:val="24"/>
-          <w:szCs w:val="24"/>
         </w:rPr>
       </w:r>
       <m:oMath xmlns:m="http://schemas.openxmlformats.org/officeDocument/2006/math">
@@ -5539,8 +5507,6 @@
         <w:jc w:val="left"/>
         <w:rPr>
           <w:rFonts w:ascii="Arial" w:hAnsi="Arial"/>
-          <w:sz w:val="24"/>
-          <w:szCs w:val="24"/>
         </w:rPr>
       </w:pPr>
       <w:r>
@@ -5582,8 +5548,6 @@
         <w:jc w:val="both"/>
         <w:rPr>
           <w:rFonts w:ascii="Arial" w:hAnsi="Arial"/>
-          <w:sz w:val="24"/>
-          <w:szCs w:val="24"/>
         </w:rPr>
       </w:pPr>
       <w:r>
@@ -5606,8 +5570,6 @@
         <w:jc w:val="both"/>
         <w:rPr>
           <w:rFonts w:ascii="Arial" w:hAnsi="Arial"/>
-          <w:sz w:val="24"/>
-          <w:szCs w:val="24"/>
         </w:rPr>
       </w:pPr>
       <w:r>
@@ -5676,8 +5638,6 @@
         <w:jc w:val="both"/>
         <w:rPr>
           <w:rFonts w:ascii="Arial" w:hAnsi="Arial"/>
-          <w:sz w:val="24"/>
-          <w:szCs w:val="24"/>
         </w:rPr>
       </w:pPr>
       <w:r>
@@ -5700,17 +5660,7 @@
           <w:sz w:val="24"/>
           <w:szCs w:val="24"/>
         </w:rPr>
-        <w:t xml:space="preserve"> </w:t>
-      </w:r>
-      <w:r>
-        <w:rPr>
-          <w:rFonts w:eastAsia="Arial" w:cs="Arial" w:ascii="Arial" w:hAnsi="Arial"/>
-          <w:b/>
-          <w:bCs/>
-          <w:sz w:val="24"/>
-          <w:szCs w:val="24"/>
-        </w:rPr>
-        <w:t>[9]</w:t>
+        <w:t xml:space="preserve"> [9]</w:t>
       </w:r>
       <w:r>
         <w:rPr>
@@ -5723,8 +5673,6 @@
       <w:r>
         <w:rPr>
           <w:rFonts w:ascii="Arial" w:hAnsi="Arial"/>
-          <w:sz w:val="24"/>
-          <w:szCs w:val="24"/>
         </w:rPr>
       </w:r>
       <m:oMath xmlns:m="http://schemas.openxmlformats.org/officeDocument/2006/math">
@@ -5746,8 +5694,6 @@
       <w:r>
         <w:rPr>
           <w:rFonts w:ascii="Arial" w:hAnsi="Arial"/>
-          <w:sz w:val="24"/>
-          <w:szCs w:val="24"/>
         </w:rPr>
       </w:r>
       <m:oMath xmlns:m="http://schemas.openxmlformats.org/officeDocument/2006/math">
@@ -5774,15 +5720,11 @@
         <w:jc w:val="center"/>
         <w:rPr>
           <w:rFonts w:ascii="Arial" w:hAnsi="Arial"/>
-          <w:sz w:val="24"/>
-          <w:szCs w:val="24"/>
-        </w:rPr>
-      </w:pPr>
-      <w:r>
-        <w:rPr>
-          <w:rFonts w:ascii="Arial" w:hAnsi="Arial"/>
-          <w:sz w:val="24"/>
-          <w:szCs w:val="24"/>
+        </w:rPr>
+      </w:pPr>
+      <w:r>
+        <w:rPr>
+          <w:rFonts w:ascii="Arial" w:hAnsi="Arial"/>
         </w:rPr>
       </w:r>
       <m:oMathPara xmlns:m="http://schemas.openxmlformats.org/officeDocument/2006/math">
@@ -5944,15 +5886,11 @@
         <w:jc w:val="both"/>
         <w:rPr>
           <w:rFonts w:ascii="Arial" w:hAnsi="Arial"/>
-          <w:sz w:val="24"/>
-          <w:szCs w:val="24"/>
-        </w:rPr>
-      </w:pPr>
-      <w:r>
-        <w:rPr>
-          <w:rFonts w:ascii="Arial" w:hAnsi="Arial"/>
-          <w:sz w:val="24"/>
-          <w:szCs w:val="24"/>
+        </w:rPr>
+      </w:pPr>
+      <w:r>
+        <w:rPr>
+          <w:rFonts w:ascii="Arial" w:hAnsi="Arial"/>
         </w:rPr>
       </w:r>
       <m:oMath xmlns:m="http://schemas.openxmlformats.org/officeDocument/2006/math">
@@ -5986,8 +5924,6 @@
       <w:r>
         <w:rPr>
           <w:rFonts w:ascii="Arial" w:hAnsi="Arial"/>
-          <w:sz w:val="24"/>
-          <w:szCs w:val="24"/>
         </w:rPr>
       </w:r>
       <m:oMath xmlns:m="http://schemas.openxmlformats.org/officeDocument/2006/math">
@@ -6009,8 +5945,6 @@
       <w:r>
         <w:rPr>
           <w:rFonts w:ascii="Arial" w:hAnsi="Arial"/>
-          <w:sz w:val="24"/>
-          <w:szCs w:val="24"/>
         </w:rPr>
       </w:r>
       <m:oMath xmlns:m="http://schemas.openxmlformats.org/officeDocument/2006/math">
@@ -6032,8 +5966,6 @@
       <w:r>
         <w:rPr>
           <w:rFonts w:ascii="Arial" w:hAnsi="Arial"/>
-          <w:sz w:val="24"/>
-          <w:szCs w:val="24"/>
         </w:rPr>
       </w:r>
       <m:oMath xmlns:m="http://schemas.openxmlformats.org/officeDocument/2006/math">
@@ -6067,8 +5999,6 @@
       <w:r>
         <w:rPr>
           <w:rFonts w:ascii="Arial" w:hAnsi="Arial"/>
-          <w:sz w:val="24"/>
-          <w:szCs w:val="24"/>
         </w:rPr>
       </w:r>
       <m:oMath xmlns:m="http://schemas.openxmlformats.org/officeDocument/2006/math">
@@ -6107,8 +6037,6 @@
         <w:jc w:val="both"/>
         <w:rPr>
           <w:rFonts w:ascii="Arial" w:hAnsi="Arial"/>
-          <w:sz w:val="24"/>
-          <w:szCs w:val="24"/>
         </w:rPr>
       </w:pPr>
       <w:r>
@@ -6131,17 +6059,7 @@
           <w:sz w:val="24"/>
           <w:szCs w:val="24"/>
         </w:rPr>
-        <w:t xml:space="preserve"> </w:t>
-      </w:r>
-      <w:r>
-        <w:rPr>
-          <w:rFonts w:eastAsia="Arial" w:cs="Arial" w:ascii="Arial" w:hAnsi="Arial"/>
-          <w:b/>
-          <w:bCs/>
-          <w:sz w:val="24"/>
-          <w:szCs w:val="24"/>
-        </w:rPr>
-        <w:t>[10]</w:t>
+        <w:t xml:space="preserve"> [10]</w:t>
       </w:r>
       <w:r>
         <w:rPr>
@@ -6154,8 +6072,6 @@
       <w:r>
         <w:rPr>
           <w:rFonts w:ascii="Arial" w:hAnsi="Arial"/>
-          <w:sz w:val="24"/>
-          <w:szCs w:val="24"/>
         </w:rPr>
       </w:r>
       <m:oMath xmlns:m="http://schemas.openxmlformats.org/officeDocument/2006/math">
@@ -6177,8 +6093,6 @@
       <w:r>
         <w:rPr>
           <w:rFonts w:ascii="Arial" w:hAnsi="Arial"/>
-          <w:sz w:val="24"/>
-          <w:szCs w:val="24"/>
         </w:rPr>
       </w:r>
       <m:oMath xmlns:m="http://schemas.openxmlformats.org/officeDocument/2006/math">
@@ -6265,15 +6179,11 @@
         <w:jc w:val="center"/>
         <w:rPr>
           <w:rFonts w:ascii="Arial" w:hAnsi="Arial"/>
-          <w:sz w:val="24"/>
-          <w:szCs w:val="24"/>
-        </w:rPr>
-      </w:pPr>
-      <w:r>
-        <w:rPr>
-          <w:rFonts w:ascii="Arial" w:hAnsi="Arial"/>
-          <w:sz w:val="24"/>
-          <w:szCs w:val="24"/>
+        </w:rPr>
+      </w:pPr>
+      <w:r>
+        <w:rPr>
+          <w:rFonts w:ascii="Arial" w:hAnsi="Arial"/>
         </w:rPr>
       </w:r>
       <m:oMathPara xmlns:m="http://schemas.openxmlformats.org/officeDocument/2006/math">
@@ -6435,8 +6345,6 @@
         <w:jc w:val="both"/>
         <w:rPr>
           <w:rFonts w:ascii="Arial" w:hAnsi="Arial"/>
-          <w:sz w:val="24"/>
-          <w:szCs w:val="24"/>
         </w:rPr>
       </w:pPr>
       <w:r>
@@ -6450,8 +6358,6 @@
       <w:r>
         <w:rPr>
           <w:rFonts w:ascii="Arial" w:hAnsi="Arial"/>
-          <w:sz w:val="24"/>
-          <w:szCs w:val="24"/>
         </w:rPr>
       </w:r>
       <m:oMath xmlns:m="http://schemas.openxmlformats.org/officeDocument/2006/math">
@@ -6503,8 +6409,6 @@
       <w:r>
         <w:rPr>
           <w:rFonts w:ascii="Arial" w:hAnsi="Arial"/>
-          <w:sz w:val="24"/>
-          <w:szCs w:val="24"/>
         </w:rPr>
       </w:r>
       <m:oMath xmlns:m="http://schemas.openxmlformats.org/officeDocument/2006/math">
@@ -6556,8 +6460,6 @@
       <w:r>
         <w:rPr>
           <w:rFonts w:ascii="Arial" w:hAnsi="Arial"/>
-          <w:sz w:val="24"/>
-          <w:szCs w:val="24"/>
         </w:rPr>
       </w:r>
       <m:oMath xmlns:m="http://schemas.openxmlformats.org/officeDocument/2006/math">
@@ -6591,8 +6493,6 @@
       <w:r>
         <w:rPr>
           <w:rFonts w:ascii="Arial" w:hAnsi="Arial"/>
-          <w:sz w:val="24"/>
-          <w:szCs w:val="24"/>
         </w:rPr>
       </w:r>
       <m:oMath xmlns:m="http://schemas.openxmlformats.org/officeDocument/2006/math">
@@ -6620,8 +6520,6 @@
       <w:r>
         <w:rPr>
           <w:rFonts w:ascii="Arial" w:hAnsi="Arial"/>
-          <w:sz w:val="24"/>
-          <w:szCs w:val="24"/>
         </w:rPr>
       </w:r>
       <m:oMath xmlns:m="http://schemas.openxmlformats.org/officeDocument/2006/math">
@@ -6643,8 +6541,6 @@
       <w:r>
         <w:rPr>
           <w:rFonts w:ascii="Arial" w:hAnsi="Arial"/>
-          <w:sz w:val="24"/>
-          <w:szCs w:val="24"/>
         </w:rPr>
       </w:r>
       <m:oMath xmlns:m="http://schemas.openxmlformats.org/officeDocument/2006/math">
@@ -6683,8 +6579,6 @@
         <w:jc w:val="both"/>
         <w:rPr>
           <w:rFonts w:ascii="Arial" w:hAnsi="Arial"/>
-          <w:sz w:val="24"/>
-          <w:szCs w:val="24"/>
         </w:rPr>
       </w:pPr>
       <w:r>
@@ -6707,27 +6601,7 @@
           <w:sz w:val="24"/>
           <w:szCs w:val="24"/>
         </w:rPr>
-        <w:t xml:space="preserve"> </w:t>
-      </w:r>
-      <w:r>
-        <w:rPr>
-          <w:rFonts w:eastAsia="Arial" w:cs="Arial" w:ascii="Arial" w:hAnsi="Arial"/>
-          <w:b/>
-          <w:bCs/>
-          <w:sz w:val="24"/>
-          <w:szCs w:val="24"/>
-        </w:rPr>
-        <w:t>[11]</w:t>
-      </w:r>
-      <w:r>
-        <w:rPr>
-          <w:rFonts w:eastAsia="Arial" w:cs="Arial" w:ascii="Arial" w:hAnsi="Arial"/>
-          <w:b/>
-          <w:bCs/>
-          <w:sz w:val="24"/>
-          <w:szCs w:val="24"/>
-        </w:rPr>
-        <w:t xml:space="preserve">: </w:t>
+        <w:t xml:space="preserve"> [11]: </w:t>
       </w:r>
       <w:r>
         <w:rPr>
@@ -6740,8 +6614,6 @@
       <w:r>
         <w:rPr>
           <w:rFonts w:ascii="Arial" w:hAnsi="Arial"/>
-          <w:sz w:val="24"/>
-          <w:szCs w:val="24"/>
         </w:rPr>
       </w:r>
       <m:oMath xmlns:m="http://schemas.openxmlformats.org/officeDocument/2006/math">
@@ -6768,15 +6640,11 @@
         <w:jc w:val="center"/>
         <w:rPr>
           <w:rFonts w:ascii="Arial" w:hAnsi="Arial"/>
-          <w:sz w:val="24"/>
-          <w:szCs w:val="24"/>
-        </w:rPr>
-      </w:pPr>
-      <w:r>
-        <w:rPr>
-          <w:rFonts w:ascii="Arial" w:hAnsi="Arial"/>
-          <w:sz w:val="24"/>
-          <w:szCs w:val="24"/>
+        </w:rPr>
+      </w:pPr>
+      <w:r>
+        <w:rPr>
+          <w:rFonts w:ascii="Arial" w:hAnsi="Arial"/>
         </w:rPr>
       </w:r>
       <m:oMathPara xmlns:m="http://schemas.openxmlformats.org/officeDocument/2006/math">
@@ -6870,15 +6738,11 @@
         <w:jc w:val="both"/>
         <w:rPr>
           <w:rFonts w:ascii="Arial" w:hAnsi="Arial"/>
-          <w:sz w:val="24"/>
-          <w:szCs w:val="24"/>
-        </w:rPr>
-      </w:pPr>
-      <w:r>
-        <w:rPr>
-          <w:rFonts w:ascii="Arial" w:hAnsi="Arial"/>
-          <w:sz w:val="24"/>
-          <w:szCs w:val="24"/>
+        </w:rPr>
+      </w:pPr>
+      <w:r>
+        <w:rPr>
+          <w:rFonts w:ascii="Arial" w:hAnsi="Arial"/>
         </w:rPr>
       </w:r>
       <m:oMath xmlns:m="http://schemas.openxmlformats.org/officeDocument/2006/math">
@@ -6936,8 +6800,6 @@
       <w:r>
         <w:rPr>
           <w:rFonts w:ascii="Arial" w:hAnsi="Arial"/>
-          <w:sz w:val="24"/>
-          <w:szCs w:val="24"/>
         </w:rPr>
       </w:r>
       <m:oMath xmlns:m="http://schemas.openxmlformats.org/officeDocument/2006/math">
@@ -6995,8 +6857,6 @@
       <w:r>
         <w:rPr>
           <w:rFonts w:ascii="Arial" w:hAnsi="Arial"/>
-          <w:sz w:val="24"/>
-          <w:szCs w:val="24"/>
         </w:rPr>
       </w:r>
       <m:oMath xmlns:m="http://schemas.openxmlformats.org/officeDocument/2006/math">
@@ -7018,8 +6878,6 @@
       <w:r>
         <w:rPr>
           <w:rFonts w:ascii="Arial" w:hAnsi="Arial"/>
-          <w:sz w:val="24"/>
-          <w:szCs w:val="24"/>
         </w:rPr>
       </w:r>
       <m:oMath xmlns:m="http://schemas.openxmlformats.org/officeDocument/2006/math">
@@ -7041,8 +6899,6 @@
       <w:r>
         <w:rPr>
           <w:rFonts w:ascii="Arial" w:hAnsi="Arial"/>
-          <w:sz w:val="24"/>
-          <w:szCs w:val="24"/>
         </w:rPr>
       </w:r>
       <m:oMath xmlns:m="http://schemas.openxmlformats.org/officeDocument/2006/math">
@@ -7076,8 +6932,6 @@
       <w:r>
         <w:rPr>
           <w:rFonts w:ascii="Arial" w:hAnsi="Arial"/>
-          <w:sz w:val="24"/>
-          <w:szCs w:val="24"/>
         </w:rPr>
       </w:r>
       <m:oMath xmlns:m="http://schemas.openxmlformats.org/officeDocument/2006/math">
@@ -7099,8 +6953,6 @@
       <w:r>
         <w:rPr>
           <w:rFonts w:ascii="Arial" w:hAnsi="Arial"/>
-          <w:sz w:val="24"/>
-          <w:szCs w:val="24"/>
         </w:rPr>
       </w:r>
       <m:oMath xmlns:m="http://schemas.openxmlformats.org/officeDocument/2006/math">
@@ -7122,8 +6974,6 @@
       <w:r>
         <w:rPr>
           <w:rFonts w:ascii="Arial" w:hAnsi="Arial"/>
-          <w:sz w:val="24"/>
-          <w:szCs w:val="24"/>
         </w:rPr>
       </w:r>
       <m:oMath xmlns:m="http://schemas.openxmlformats.org/officeDocument/2006/math">
@@ -7266,8 +7116,6 @@
         <w:jc w:val="both"/>
         <w:rPr>
           <w:rFonts w:ascii="Arial" w:hAnsi="Arial"/>
-          <w:sz w:val="24"/>
-          <w:szCs w:val="24"/>
         </w:rPr>
       </w:pPr>
       <w:r>
@@ -7291,8 +7139,6 @@
         <w:jc w:val="both"/>
         <w:rPr>
           <w:rFonts w:ascii="Arial" w:hAnsi="Arial"/>
-          <w:sz w:val="24"/>
-          <w:szCs w:val="24"/>
         </w:rPr>
       </w:pPr>
       <w:r>
@@ -7313,70 +7159,19 @@
         <w:jc w:val="both"/>
         <w:rPr>
           <w:rFonts w:ascii="Arial" w:hAnsi="Arial"/>
+        </w:rPr>
+      </w:pPr>
+      <w:r>
+        <w:rPr>
+          <w:rFonts w:eastAsia="Arial" w:cs="Arial" w:ascii="Arial" w:hAnsi="Arial"/>
           <w:color w:val="auto"/>
-          <w:sz w:val="24"/>
-          <w:szCs w:val="24"/>
-        </w:rPr>
-      </w:pPr>
-      <w:r>
-        <w:rPr>
-          <w:rFonts w:eastAsia="Arial" w:cs="Arial" w:ascii="Arial" w:hAnsi="Arial"/>
-          <w:color w:val="auto"/>
-          <w:position w:val="0"/>
-          <w:sz w:val="24"/>
-          <w:sz w:val="24"/>
-          <w:szCs w:val="24"/>
-          <w:vertAlign w:val="baseline"/>
-        </w:rPr>
-        <w:t>Para la validación experimental se emplearán ADReSS derivad</w:t>
-      </w:r>
-      <w:r>
-        <w:rPr>
-          <w:rFonts w:eastAsia="Arial" w:cs="Arial" w:ascii="Arial" w:hAnsi="Arial"/>
-          <w:color w:val="auto"/>
-          <w:position w:val="0"/>
-          <w:sz w:val="24"/>
-          <w:sz w:val="24"/>
-          <w:szCs w:val="24"/>
-          <w:vertAlign w:val="baseline"/>
-        </w:rPr>
-        <w:t>a</w:t>
-      </w:r>
-      <w:r>
-        <w:rPr>
-          <w:rFonts w:eastAsia="Arial" w:cs="Arial" w:ascii="Arial" w:hAnsi="Arial"/>
-          <w:color w:val="auto"/>
-          <w:position w:val="0"/>
-          <w:sz w:val="24"/>
-          <w:sz w:val="24"/>
-          <w:szCs w:val="24"/>
-          <w:vertAlign w:val="baseline"/>
-        </w:rPr>
-        <w:t xml:space="preserve"> del Pitt Corpus (DementiaBank) y diseñados para la clasificación automática AD vs. control mediante los retos Interspeech Challenge. ADReSS </w:t>
-      </w:r>
-      <w:r>
-        <w:rPr>
-          <w:rFonts w:eastAsia="Arial" w:cs="Arial" w:ascii="Arial" w:hAnsi="Arial"/>
-          <w:color w:val="auto"/>
-          <w:position w:val="0"/>
-          <w:sz w:val="24"/>
-          <w:sz w:val="24"/>
-          <w:szCs w:val="24"/>
-          <w:vertAlign w:val="baseline"/>
-        </w:rPr>
-        <w:t>[7]</w:t>
-      </w:r>
-      <w:r>
-        <w:rPr>
-          <w:rFonts w:eastAsia="Arial" w:cs="Arial" w:ascii="Arial" w:hAnsi="Arial"/>
-          <w:color w:val="auto"/>
-          <w:position w:val="0"/>
-          <w:sz w:val="24"/>
-          <w:sz w:val="24"/>
-          <w:szCs w:val="24"/>
-          <w:vertAlign w:val="baseline"/>
-        </w:rPr>
-        <w:t xml:space="preserve"> reúne 156 hablantes (78 con AD, 78 controles), balanceados por edad y género, divididos en 108 hablantes de entrenamiento y 48 de prueba, a partir de la descripción de la lámina </w:t>
+          <w:position w:val="0"/>
+          <w:sz w:val="24"/>
+          <w:sz w:val="24"/>
+          <w:szCs w:val="24"/>
+          <w:vertAlign w:val="baseline"/>
+        </w:rPr>
+        <w:t xml:space="preserve">Para la validación experimental se emplearán ADReSS derivada del Pitt Corpus (DementiaBank) y diseñados para la clasificación automática AD vs. control mediante los retos Interspeech Challenge. ADReSS [7] reúne 156 hablantes (78 con AD, 78 controles), balanceados por edad y género, divididos en 108 hablantes de entrenamiento y 48 de prueba, a partir de la descripción de la lámina </w:t>
       </w:r>
       <w:r>
         <w:rPr>
@@ -7402,19 +7197,7 @@
           <w:szCs w:val="24"/>
           <w:vertAlign w:val="baseline"/>
         </w:rPr>
-        <w:t xml:space="preserve"> del Boston Diagnostic Aphasia Exam. </w:t>
-      </w:r>
-      <w:r>
-        <w:rPr>
-          <w:rFonts w:eastAsia="Arial" w:cs="Arial" w:ascii="Arial" w:hAnsi="Arial"/>
-          <w:color w:val="auto"/>
-          <w:position w:val="0"/>
-          <w:sz w:val="24"/>
-          <w:sz w:val="24"/>
-          <w:szCs w:val="24"/>
-          <w:vertAlign w:val="baseline"/>
-        </w:rPr>
-        <w:t xml:space="preserve"> </w:t>
+        <w:t xml:space="preserve"> del Boston Diagnostic Aphasia Exam.  </w:t>
       </w:r>
     </w:p>
     <w:p>
@@ -7422,15 +7205,13 @@
         <w:pStyle w:val="BodyText"/>
         <w:spacing w:lineRule="auto" w:line="240" w:before="240" w:after="240"/>
         <w:jc w:val="both"/>
-        <w:rPr>
+        <w:rPr/>
+      </w:pPr>
+      <w:r>
+        <w:rPr>
+          <w:rStyle w:val="Strong"/>
+          <w:rFonts w:eastAsia="Arial" w:cs="Arial" w:ascii="Arial" w:hAnsi="Arial"/>
           <w:color w:val="auto"/>
-        </w:rPr>
-      </w:pPr>
-      <w:r>
-        <w:rPr>
-          <w:rStyle w:val="Strong"/>
-          <w:rFonts w:eastAsia="Arial" w:cs="Arial" w:ascii="Arial" w:hAnsi="Arial"/>
-          <w:color w:val="auto"/>
           <w:position w:val="0"/>
           <w:sz w:val="24"/>
           <w:sz w:val="24"/>
@@ -7445,65 +7226,15 @@
         <w:pStyle w:val="BodyText"/>
         <w:rPr>
           <w:rFonts w:ascii="Arial" w:hAnsi="Arial"/>
-          <w:sz w:val="24"/>
-          <w:szCs w:val="24"/>
-        </w:rPr>
-      </w:pPr>
-      <w:r>
-        <w:rPr>
-          <w:rFonts w:ascii="Arial" w:hAnsi="Arial"/>
-          <w:sz w:val="24"/>
-          <w:szCs w:val="24"/>
-        </w:rPr>
-        <w:t xml:space="preserve">En esta fase, el audio preprocesado se pasa directamente al modelo Wav2Vec 2.0 preentrenado sin activar ninguna de las cuatro estrategias PEFT. El modelo actúa únicamente como extractor de representaciones: todos sus pesos permanecen </w:t>
-      </w:r>
-      <w:r>
-        <w:rPr>
-          <w:rFonts w:ascii="Arial" w:hAnsi="Arial"/>
-          <w:sz w:val="24"/>
-          <w:szCs w:val="24"/>
-        </w:rPr>
-        <w:t>estaticos</w:t>
-      </w:r>
-      <w:r>
-        <w:rPr>
-          <w:rFonts w:ascii="Arial" w:hAnsi="Arial"/>
-          <w:sz w:val="24"/>
-          <w:szCs w:val="24"/>
-        </w:rPr>
-        <w:t xml:space="preserve"> y solo se entrena la capa de clasificación (AD vs CTR) sobre </w:t>
-      </w:r>
-      <w:r>
-        <w:rPr>
-          <w:rFonts w:ascii="Arial" w:hAnsi="Arial"/>
-          <w:sz w:val="24"/>
-          <w:szCs w:val="24"/>
-        </w:rPr>
-        <w:t>dichas representaciones</w:t>
-      </w:r>
-      <w:r>
-        <w:rPr>
-          <w:rFonts w:ascii="Arial" w:hAnsi="Arial"/>
-          <w:sz w:val="24"/>
-          <w:szCs w:val="24"/>
-        </w:rPr>
-        <w:t xml:space="preserve">. El resultado de esta fase es el punto de referencia frente al cual se medirán todas las estrategias de adaptación, y responde a la pregunta de si las representaciones aprendidas de forma genérica transfieren de manera útil a la tarea de clasificación clínica sin ningún tipo de especialización </w:t>
-      </w:r>
-      <w:r>
-        <w:rPr>
-          <w:rFonts w:ascii="Arial" w:hAnsi="Arial"/>
-          <w:sz w:val="24"/>
-          <w:szCs w:val="24"/>
-        </w:rPr>
-        <w:t>en la cabecera</w:t>
-      </w:r>
-      <w:r>
-        <w:rPr>
-          <w:rFonts w:ascii="Arial" w:hAnsi="Arial"/>
-          <w:sz w:val="24"/>
-          <w:szCs w:val="24"/>
-        </w:rPr>
-        <w:t>.</w:t>
+        </w:rPr>
+      </w:pPr>
+      <w:r>
+        <w:rPr>
+          <w:rFonts w:ascii="Arial" w:hAnsi="Arial"/>
+          <w:sz w:val="24"/>
+          <w:szCs w:val="24"/>
+        </w:rPr>
+        <w:t>En esta fase, el audio preprocesado se pasa directamente al modelo Wav2Vec 2.0 preentrenado sin activar ninguna de las cuatro estrategias PEFT. El modelo actúa únicamente como extractor de representaciones: todos sus pesos permanecen estaticos y solo se entrena la capa de clasificación (AD vs CTR) sobre dichas representaciones. El resultado de esta fase es el punto de referencia frente al cual se medirán todas las estrategias de adaptación, y responde a la pregunta de si las representaciones aprendidas de forma genérica transfieren de manera útil a la tarea de clasificación clínica sin ningún tipo de especialización en la cabecera.</w:t>
       </w:r>
     </w:p>
     <w:p>
@@ -7522,7 +7253,7 @@
           <w:szCs w:val="24"/>
         </w:rPr>
         <w:drawing>
-          <wp:anchor behindDoc="0" distT="0" distB="0" distL="0" distR="0" simplePos="0" locked="0" layoutInCell="0" allowOverlap="1" relativeHeight="85">
+          <wp:anchor behindDoc="0" distT="0" distB="0" distL="0" distR="0" simplePos="0" locked="0" layoutInCell="0" allowOverlap="1" relativeHeight="89">
             <wp:simplePos x="0" y="0"/>
             <wp:positionH relativeFrom="column">
               <wp:align>center</wp:align>
@@ -7530,7 +7261,7 @@
             <wp:positionV relativeFrom="paragraph">
               <wp:posOffset>635</wp:posOffset>
             </wp:positionV>
-            <wp:extent cx="5759450" cy="2101215"/>
+            <wp:extent cx="5759450" cy="2329815"/>
             <wp:effectExtent l="0" t="0" r="0" b="0"/>
             <wp:wrapSquare wrapText="largest"/>
             <wp:docPr id="1" name="Image1" descr=""/>
@@ -7555,7 +7286,7 @@
                   <pic:spPr bwMode="auto">
                     <a:xfrm>
                       <a:off x="0" y="0"/>
-                      <a:ext cx="5759450" cy="2101215"/>
+                      <a:ext cx="5759450" cy="2329815"/>
                     </a:xfrm>
                     <a:prstGeom prst="rect">
                       <a:avLst/>
@@ -7588,47 +7319,32 @@
         <w:pStyle w:val="BodyText"/>
         <w:rPr>
           <w:rFonts w:ascii="Arial" w:hAnsi="Arial"/>
-          <w:sz w:val="24"/>
-          <w:szCs w:val="24"/>
-        </w:rPr>
-      </w:pPr>
-      <w:r>
-        <w:rPr>
-          <w:rFonts w:ascii="Arial" w:hAnsi="Arial"/>
-          <w:sz w:val="24"/>
-          <w:szCs w:val="24"/>
-        </w:rPr>
-        <w:t xml:space="preserve">El mismo modelo preentrenado se somete, de forma independiente, a cada una de las cuatro estrategias evaluadas: adaptadores bottleneck, LoRA, prefix-tuning y descongelamiento parcial de capas , produciendo cuatro variantes adaptadas distintas del modelo, cada una entrenada por separado sobre el mismo conjunto de datos y bajo las mismas condiciones que la fase 1. Esta fase genera los cuatro resultados experimentales de clasificación </w:t>
-      </w:r>
-      <w:r>
-        <w:rPr>
-          <w:rFonts w:ascii="Arial" w:hAnsi="Arial"/>
-          <w:sz w:val="24"/>
-          <w:szCs w:val="24"/>
-        </w:rPr>
-        <w:t>a comparar con el modelo original</w:t>
-      </w:r>
-      <w:r>
-        <w:rPr>
-          <w:rFonts w:ascii="Arial" w:hAnsi="Arial"/>
-          <w:sz w:val="24"/>
-          <w:szCs w:val="24"/>
-        </w:rPr>
-        <w:t>.</w:t>
+        </w:rPr>
+      </w:pPr>
+      <w:r>
+        <w:rPr>
+          <w:rFonts w:ascii="Arial" w:hAnsi="Arial"/>
+          <w:sz w:val="24"/>
+          <w:szCs w:val="24"/>
+        </w:rPr>
+        <w:t>El mismo modelo preentrenado se somete, de forma independiente, a cada una de las cuatro estrategias evaluadas: adaptadores bottleneck, LoRA, prefix-tuning y descongelamiento parcial de capas , produciendo cuatro variantes adaptadas distintas del modelo, cada una entrenada por separado sobre el mismo conjunto de datos y bajo las mismas condiciones que la fase 1. Esta fase genera los cuatro resultados experimentales de clasificación a comparar con el modelo original.</w:t>
       </w:r>
     </w:p>
     <w:p>
       <w:pPr>
         <w:pStyle w:val="BodyText"/>
         <w:rPr>
-          <w:rStyle w:val="Strong"/>
-          <w:rFonts w:ascii="Arial" w:hAnsi="Arial"/>
-          <w:sz w:val="24"/>
-          <w:szCs w:val="24"/>
-        </w:rPr>
-      </w:pPr>
-      <w:r>
-        <w:rPr/>
+          <w:rFonts w:ascii="Arial" w:hAnsi="Arial"/>
+          <w:sz w:val="24"/>
+          <w:szCs w:val="24"/>
+        </w:rPr>
+      </w:pPr>
+      <w:r>
+        <w:rPr>
+          <w:rFonts w:ascii="Arial" w:hAnsi="Arial"/>
+          <w:sz w:val="24"/>
+          <w:szCs w:val="24"/>
+        </w:rPr>
       </w:r>
     </w:p>
     <w:p>
@@ -7643,43 +7359,7 @@
           <w:sz w:val="24"/>
           <w:szCs w:val="24"/>
         </w:rPr>
-        <w:t xml:space="preserve">Fase 3: Comparación de </w:t>
-      </w:r>
-      <w:r>
-        <w:rPr>
-          <w:rStyle w:val="Strong"/>
-          <w:rFonts w:ascii="Arial" w:hAnsi="Arial"/>
-          <w:sz w:val="24"/>
-          <w:szCs w:val="24"/>
-        </w:rPr>
-        <w:t xml:space="preserve">fase </w:t>
-      </w:r>
-      <w:r>
-        <w:rPr>
-          <w:rStyle w:val="Strong"/>
-          <w:rFonts w:ascii="Arial" w:hAnsi="Arial"/>
-          <w:sz w:val="24"/>
-          <w:szCs w:val="24"/>
-        </w:rPr>
-        <w:t xml:space="preserve">1 y </w:t>
-      </w:r>
-      <w:r>
-        <w:rPr>
-          <w:rStyle w:val="Strong"/>
-          <w:rFonts w:ascii="Arial" w:hAnsi="Arial"/>
-          <w:sz w:val="24"/>
-          <w:szCs w:val="24"/>
-        </w:rPr>
-        <w:t xml:space="preserve">fase </w:t>
-      </w:r>
-      <w:r>
-        <w:rPr>
-          <w:rStyle w:val="Strong"/>
-          <w:rFonts w:ascii="Arial" w:hAnsi="Arial"/>
-          <w:sz w:val="24"/>
-          <w:szCs w:val="24"/>
-        </w:rPr>
-        <w:t>2</w:t>
+        <w:t>Fase 3: Comparación de fase 1 y fase 2</w:t>
       </w:r>
     </w:p>
     <w:p>
@@ -7687,177 +7367,15 @@
         <w:pStyle w:val="BodyText"/>
         <w:rPr>
           <w:rFonts w:ascii="Arial" w:hAnsi="Arial"/>
-          <w:sz w:val="24"/>
-          <w:szCs w:val="24"/>
-        </w:rPr>
-      </w:pPr>
-      <w:r>
-        <w:rPr>
-          <w:rFonts w:ascii="Arial" w:hAnsi="Arial"/>
-          <w:sz w:val="24"/>
-          <w:szCs w:val="24"/>
-        </w:rPr>
-        <w:t xml:space="preserve">Esta fase no representa un nuevo paso por el </w:t>
-      </w:r>
-      <w:r>
-        <w:rPr>
-          <w:rFonts w:ascii="Arial" w:hAnsi="Arial"/>
-          <w:sz w:val="24"/>
-          <w:szCs w:val="24"/>
-        </w:rPr>
-        <w:t xml:space="preserve">flujo </w:t>
-      </w:r>
-      <w:r>
-        <w:rPr>
-          <w:rFonts w:ascii="Arial" w:hAnsi="Arial"/>
-          <w:sz w:val="24"/>
-          <w:szCs w:val="24"/>
-        </w:rPr>
-        <w:t xml:space="preserve">del diagrama </w:t>
-      </w:r>
-      <w:r>
-        <w:rPr>
-          <w:rFonts w:ascii="Arial" w:hAnsi="Arial"/>
-          <w:sz w:val="24"/>
-          <w:szCs w:val="24"/>
-        </w:rPr>
-        <w:t>metodologico</w:t>
-      </w:r>
-      <w:r>
-        <w:rPr>
-          <w:rFonts w:ascii="Arial" w:hAnsi="Arial"/>
-          <w:sz w:val="24"/>
-          <w:szCs w:val="24"/>
-        </w:rPr>
-        <w:t>, sino un análisis transversal que toma los resultados de evaluación de las fases 1 y 2 y los confront</w:t>
-      </w:r>
-      <w:r>
-        <w:rPr>
-          <w:rFonts w:ascii="Arial" w:hAnsi="Arial"/>
-          <w:sz w:val="24"/>
-          <w:szCs w:val="24"/>
-        </w:rPr>
-        <w:t>a desde dos puntos de vista</w:t>
-      </w:r>
-      <w:r>
-        <w:rPr>
-          <w:rFonts w:ascii="Arial" w:hAnsi="Arial"/>
-          <w:sz w:val="24"/>
-          <w:szCs w:val="24"/>
-        </w:rPr>
-        <w:t xml:space="preserve">: </w:t>
-      </w:r>
-      <w:r>
-        <w:rPr>
-          <w:rFonts w:ascii="Arial" w:hAnsi="Arial"/>
-          <w:sz w:val="24"/>
-          <w:szCs w:val="24"/>
-        </w:rPr>
-        <w:t xml:space="preserve">el </w:t>
-      </w:r>
-      <w:r>
-        <w:rPr>
-          <w:rFonts w:ascii="Arial" w:hAnsi="Arial"/>
-          <w:sz w:val="24"/>
-          <w:szCs w:val="24"/>
-        </w:rPr>
-        <w:t xml:space="preserve">desempeño de clasificación </w:t>
-      </w:r>
-      <w:r>
-        <w:rPr>
-          <w:rFonts w:ascii="Arial" w:hAnsi="Arial"/>
-          <w:sz w:val="24"/>
-          <w:szCs w:val="24"/>
-        </w:rPr>
-        <w:t xml:space="preserve">obtenido entre el modelo original y sus versiones ajustadas </w:t>
-      </w:r>
-      <w:r>
-        <w:rPr>
-          <w:rFonts w:ascii="Arial" w:hAnsi="Arial"/>
-          <w:sz w:val="24"/>
-          <w:szCs w:val="24"/>
-        </w:rPr>
-        <w:t xml:space="preserve"> y e</w:t>
-      </w:r>
-      <w:r>
-        <w:rPr>
-          <w:rFonts w:ascii="Arial" w:hAnsi="Arial"/>
-          <w:sz w:val="24"/>
-          <w:szCs w:val="24"/>
-        </w:rPr>
-        <w:t>l tiempo de ejecución requerido por cada una de las estrategias implementadas</w:t>
-      </w:r>
-      <w:r>
-        <w:rPr>
-          <w:rFonts w:ascii="Arial" w:hAnsi="Arial"/>
-          <w:sz w:val="24"/>
-          <w:szCs w:val="24"/>
-        </w:rPr>
-        <w:t xml:space="preserve">. Esta doble comparación es la que permite responder directamente la hipótesis central de la tesis: si el ajuste eficiente de parámetros logra igualar o superar al modelo </w:t>
-      </w:r>
-      <w:r>
-        <w:rPr>
-          <w:rFonts w:ascii="Arial" w:hAnsi="Arial"/>
-          <w:sz w:val="24"/>
-          <w:szCs w:val="24"/>
-        </w:rPr>
-        <w:t>estatico</w:t>
-      </w:r>
-      <w:r>
-        <w:rPr>
-          <w:rFonts w:ascii="Arial" w:hAnsi="Arial"/>
-          <w:sz w:val="24"/>
-          <w:szCs w:val="24"/>
-        </w:rPr>
-        <w:t>, y c</w:t>
-      </w:r>
-      <w:r>
-        <w:rPr>
-          <w:rFonts w:ascii="Arial" w:hAnsi="Arial"/>
-          <w:sz w:val="24"/>
-          <w:szCs w:val="24"/>
-        </w:rPr>
-        <w:t>ual es el tiempo promedio en el cual</w:t>
-      </w:r>
-      <w:r>
-        <w:rPr>
-          <w:rFonts w:ascii="Arial" w:hAnsi="Arial"/>
-          <w:sz w:val="24"/>
-          <w:szCs w:val="24"/>
-        </w:rPr>
-        <w:t xml:space="preserve"> lo logra en relación con un </w:t>
-      </w:r>
-      <w:r>
-        <w:rPr>
-          <w:rFonts w:ascii="Arial" w:hAnsi="Arial"/>
-          <w:sz w:val="24"/>
-          <w:szCs w:val="24"/>
-        </w:rPr>
-        <w:t>ajuste</w:t>
-      </w:r>
-      <w:r>
-        <w:rPr>
-          <w:rFonts w:ascii="Arial" w:hAnsi="Arial"/>
-          <w:sz w:val="24"/>
-          <w:szCs w:val="24"/>
-        </w:rPr>
-        <w:t xml:space="preserve"> completo </w:t>
-      </w:r>
-      <w:r>
-        <w:rPr>
-          <w:rFonts w:ascii="Arial" w:hAnsi="Arial"/>
-          <w:sz w:val="24"/>
-          <w:szCs w:val="24"/>
-        </w:rPr>
-        <w:t xml:space="preserve">del modelo en el que se reentrenan todos los pesos de wav2vec 2.0 </w:t>
-      </w:r>
-      <w:r>
-        <w:rPr>
-          <w:rFonts w:ascii="Arial" w:hAnsi="Arial"/>
-          <w:sz w:val="24"/>
-          <w:szCs w:val="24"/>
-        </w:rPr>
-        <w:t>.</w:t>
+        </w:rPr>
+      </w:pPr>
+      <w:r>
+        <w:rPr>
+          <w:rFonts w:ascii="Arial" w:hAnsi="Arial"/>
+          <w:sz w:val="24"/>
+          <w:szCs w:val="24"/>
+        </w:rPr>
+        <w:t>Esta fase no representa un nuevo paso por el flujo del diagrama metodologico, sino un análisis transversal que toma los resultados de evaluación de las fases 1 y 2 y los confronta desde dos puntos de vista: el desempeño de clasificación obtenido entre el modelo original y sus versiones ajustadas  y el tiempo de ejecución requerido por cada una de las estrategias implementadas. Esta doble comparación es la que permite responder directamente la hipótesis central de la tesis: si el ajuste eficiente de parámetros logra igualar o superar al modelo estatico, y cual es el tiempo promedio en el cual lo logra en relación con un ajuste completo del modelo en el que se reentrenan todos los pesos de wav2vec 2.0 .</w:t>
       </w:r>
     </w:p>
     <w:p>
@@ -7866,18 +7384,20 @@
         <w:spacing w:lineRule="auto" w:line="240" w:before="240" w:after="240"/>
         <w:jc w:val="both"/>
         <w:rPr>
-          <w:rFonts w:eastAsia="Arial" w:cs="Arial"/>
-          <w:position w:val="0"/>
-          <w:sz w:val="24"/>
-          <w:vertAlign w:val="baseline"/>
-        </w:rPr>
-      </w:pPr>
-      <w:r>
-        <w:rPr>
-          <w:rFonts w:ascii="Arial" w:hAnsi="Arial"/>
-          <w:color w:val="auto"/>
-          <w:sz w:val="24"/>
-          <w:szCs w:val="24"/>
+          <w:rFonts w:ascii="Arial" w:hAnsi="Arial" w:eastAsia="Arial" w:cs="Arial"/>
+          <w:position w:val="0"/>
+          <w:sz w:val="24"/>
+          <w:sz w:val="24"/>
+          <w:vertAlign w:val="baseline"/>
+        </w:rPr>
+      </w:pPr>
+      <w:r>
+        <w:rPr>
+          <w:rFonts w:eastAsia="Arial" w:cs="Arial" w:ascii="Arial" w:hAnsi="Arial"/>
+          <w:position w:val="0"/>
+          <w:sz w:val="24"/>
+          <w:sz w:val="24"/>
+          <w:vertAlign w:val="baseline"/>
         </w:rPr>
       </w:r>
     </w:p>
@@ -7917,8 +7437,6 @@
         <w:jc w:val="both"/>
         <w:rPr>
           <w:rFonts w:ascii="Arial" w:hAnsi="Arial"/>
-          <w:sz w:val="24"/>
-          <w:szCs w:val="24"/>
         </w:rPr>
       </w:pPr>
       <w:r>
@@ -7938,24 +7456,59 @@
     <w:p>
       <w:pPr>
         <w:pStyle w:val="normal1"/>
-        <w:jc w:val="both"/>
-        <w:rPr>
-          <w:rFonts w:ascii="Arial" w:hAnsi="Arial"/>
-          <w:sz w:val="24"/>
-          <w:szCs w:val="24"/>
-        </w:rPr>
-      </w:pPr>
-      <w:r>
-        <w:rPr>
-          <w:rFonts w:eastAsia="Arial" w:cs="Arial" w:ascii="Arial" w:hAnsi="Arial"/>
-          <w:color w:val="7F7F7F"/>
-          <w:position w:val="0"/>
-          <w:sz w:val="24"/>
-          <w:sz w:val="24"/>
-          <w:szCs w:val="24"/>
-          <w:vertAlign w:val="baseline"/>
-        </w:rPr>
-        <w:t xml:space="preserve">Se describen las diferentes actividades a realizar según la metodología, indicando el tiempo programado para su ejecución. </w:t>
+        <w:rPr>
+          <w:rFonts w:ascii="Arial" w:hAnsi="Arial"/>
+        </w:rPr>
+      </w:pPr>
+      <w:r>
+        <w:rPr>
+          <w:rFonts w:ascii="Arial" w:hAnsi="Arial"/>
+        </w:rPr>
+        <w:drawing>
+          <wp:anchor behindDoc="0" distT="0" distB="0" distL="0" distR="0" simplePos="0" locked="0" layoutInCell="0" allowOverlap="1" relativeHeight="90">
+            <wp:simplePos x="0" y="0"/>
+            <wp:positionH relativeFrom="column">
+              <wp:align>center</wp:align>
+            </wp:positionH>
+            <wp:positionV relativeFrom="paragraph">
+              <wp:posOffset>635</wp:posOffset>
+            </wp:positionV>
+            <wp:extent cx="5759450" cy="2197735"/>
+            <wp:effectExtent l="0" t="0" r="0" b="0"/>
+            <wp:wrapSquare wrapText="largest"/>
+            <wp:docPr id="2" name="Image2" descr=""/>
+            <wp:cNvGraphicFramePr>
+              <a:graphicFrameLocks xmlns:a="http://schemas.openxmlformats.org/drawingml/2006/main" noChangeAspect="1"/>
+            </wp:cNvGraphicFramePr>
+            <a:graphic xmlns:a="http://schemas.openxmlformats.org/drawingml/2006/main">
+              <a:graphicData uri="http://schemas.openxmlformats.org/drawingml/2006/picture">
+                <pic:pic xmlns:pic="http://schemas.openxmlformats.org/drawingml/2006/picture">
+                  <pic:nvPicPr>
+                    <pic:cNvPr id="2" name="Image2" descr=""/>
+                    <pic:cNvPicPr>
+                      <a:picLocks noChangeAspect="1" noChangeArrowheads="1"/>
+                    </pic:cNvPicPr>
+                  </pic:nvPicPr>
+                  <pic:blipFill>
+                    <a:blip r:embed="rId3"/>
+                    <a:stretch>
+                      <a:fillRect/>
+                    </a:stretch>
+                  </pic:blipFill>
+                  <pic:spPr bwMode="auto">
+                    <a:xfrm>
+                      <a:off x="0" y="0"/>
+                      <a:ext cx="5759450" cy="2197735"/>
+                    </a:xfrm>
+                    <a:prstGeom prst="rect">
+                      <a:avLst/>
+                    </a:prstGeom>
+                  </pic:spPr>
+                </pic:pic>
+              </a:graphicData>
+            </a:graphic>
+          </wp:anchor>
+        </w:drawing>
       </w:r>
     </w:p>
     <w:p>
@@ -7994,8 +7547,76 @@
         <w:jc w:val="both"/>
         <w:rPr>
           <w:rFonts w:ascii="Arial" w:hAnsi="Arial"/>
-          <w:sz w:val="24"/>
-          <w:szCs w:val="24"/>
+        </w:rPr>
+      </w:pPr>
+      <w:r>
+        <w:rPr>
+          <w:rFonts w:ascii="Arial" w:hAnsi="Arial"/>
+        </w:rPr>
+      </w:r>
+    </w:p>
+    <w:p>
+      <w:pPr>
+        <w:pStyle w:val="normal1"/>
+        <w:jc w:val="both"/>
+        <w:rPr>
+          <w:rFonts w:ascii="Arial" w:hAnsi="Arial"/>
+        </w:rPr>
+      </w:pPr>
+      <w:r>
+        <w:rPr>
+          <w:rFonts w:ascii="Arial" w:hAnsi="Arial"/>
+        </w:rPr>
+      </w:r>
+    </w:p>
+    <w:p>
+      <w:pPr>
+        <w:pStyle w:val="normal1"/>
+        <w:jc w:val="both"/>
+        <w:rPr>
+          <w:rFonts w:ascii="Arial" w:hAnsi="Arial"/>
+        </w:rPr>
+      </w:pPr>
+      <w:r>
+        <w:rPr>
+          <w:rFonts w:ascii="Arial" w:hAnsi="Arial"/>
+        </w:rPr>
+      </w:r>
+    </w:p>
+    <w:p>
+      <w:pPr>
+        <w:pStyle w:val="normal1"/>
+        <w:jc w:val="both"/>
+        <w:rPr>
+          <w:rFonts w:ascii="Arial" w:hAnsi="Arial"/>
+        </w:rPr>
+      </w:pPr>
+      <w:r>
+        <w:rPr>
+          <w:rFonts w:ascii="Arial" w:hAnsi="Arial"/>
+        </w:rPr>
+      </w:r>
+    </w:p>
+    <w:p>
+      <w:pPr>
+        <w:pStyle w:val="normal1"/>
+        <w:jc w:val="both"/>
+        <w:rPr>
+          <w:rFonts w:ascii="Arial" w:hAnsi="Arial"/>
+        </w:rPr>
+      </w:pPr>
+      <w:r>
+        <w:rPr>
+          <w:rFonts w:ascii="Arial" w:hAnsi="Arial"/>
+        </w:rPr>
+      </w:r>
+    </w:p>
+    <w:p>
+      <w:pPr>
+        <w:pStyle w:val="normal1"/>
+        <w:jc w:val="both"/>
+        <w:rPr>
+          <w:rFonts w:ascii="Arial" w:hAnsi="Arial"/>
         </w:rPr>
       </w:pPr>
       <w:r>
@@ -8018,8 +7639,285 @@
         <w:jc w:val="both"/>
         <w:rPr>
           <w:rFonts w:ascii="Arial" w:hAnsi="Arial"/>
-          <w:sz w:val="24"/>
-          <w:szCs w:val="24"/>
+        </w:rPr>
+      </w:pPr>
+      <w:r>
+        <w:rPr>
+          <w:rFonts w:ascii="Arial" w:hAnsi="Arial"/>
+        </w:rPr>
+      </w:r>
+    </w:p>
+    <w:p>
+      <w:pPr>
+        <w:pStyle w:val="BodyText"/>
+        <w:jc w:val="both"/>
+        <w:rPr>
+          <w:rFonts w:ascii="Arial" w:hAnsi="Arial"/>
+          <w:b w:val="false"/>
+          <w:bCs w:val="false"/>
+        </w:rPr>
+      </w:pPr>
+      <w:r>
+        <w:rPr>
+          <w:rFonts w:eastAsia="Arial" w:cs="Arial" w:ascii="Arial" w:hAnsi="Arial"/>
+          <w:b w:val="false"/>
+          <w:bCs w:val="false"/>
+          <w:position w:val="0"/>
+          <w:sz w:val="24"/>
+          <w:sz w:val="24"/>
+          <w:szCs w:val="24"/>
+          <w:vertAlign w:val="baseline"/>
+        </w:rPr>
+        <w:t xml:space="preserve">Con la ejecución de las tres fases descritas en la metodología, se espera obtener un conjunto de hallazgos que permitan responder </w:t>
+      </w:r>
+      <w:r>
+        <w:rPr>
+          <w:rFonts w:eastAsia="Arial" w:cs="Arial" w:ascii="Arial" w:hAnsi="Arial"/>
+          <w:b w:val="false"/>
+          <w:bCs w:val="false"/>
+          <w:position w:val="0"/>
+          <w:sz w:val="24"/>
+          <w:sz w:val="24"/>
+          <w:szCs w:val="24"/>
+          <w:vertAlign w:val="baseline"/>
+        </w:rPr>
+        <w:t xml:space="preserve">a </w:t>
+      </w:r>
+      <w:r>
+        <w:rPr>
+          <w:rFonts w:eastAsia="Arial" w:cs="Arial" w:ascii="Arial" w:hAnsi="Arial"/>
+          <w:b w:val="false"/>
+          <w:bCs w:val="false"/>
+          <w:position w:val="0"/>
+          <w:sz w:val="24"/>
+          <w:sz w:val="24"/>
+          <w:szCs w:val="24"/>
+          <w:vertAlign w:val="baseline"/>
+        </w:rPr>
+        <w:t xml:space="preserve">la hipótesis central de este trabajo: que la adaptación mediante estrategias de ajuste eficiente de parámetros (PEFT) mejora el desempeño de clasificación de wav2vec 2.0 en la tarea de discriminación entre pacientes con enfermedad de Alzheimer y controles sanos, incluso en presencia de datos etiquetados limitados, respecto a un modelo </w:t>
+      </w:r>
+      <w:r>
+        <w:rPr>
+          <w:rFonts w:eastAsia="Arial" w:cs="Arial" w:ascii="Arial" w:hAnsi="Arial"/>
+          <w:b w:val="false"/>
+          <w:bCs w:val="false"/>
+          <w:position w:val="0"/>
+          <w:sz w:val="24"/>
+          <w:sz w:val="24"/>
+          <w:szCs w:val="24"/>
+          <w:vertAlign w:val="baseline"/>
+        </w:rPr>
+        <w:t>estatico</w:t>
+      </w:r>
+      <w:r>
+        <w:rPr>
+          <w:rFonts w:eastAsia="Arial" w:cs="Arial" w:ascii="Arial" w:hAnsi="Arial"/>
+          <w:b w:val="false"/>
+          <w:bCs w:val="false"/>
+          <w:position w:val="0"/>
+          <w:sz w:val="24"/>
+          <w:sz w:val="24"/>
+          <w:szCs w:val="24"/>
+          <w:vertAlign w:val="baseline"/>
+        </w:rPr>
+        <w:t xml:space="preserve"> sin ningún tipo de especialización.</w:t>
+      </w:r>
+    </w:p>
+    <w:p>
+      <w:pPr>
+        <w:pStyle w:val="BodyText"/>
+        <w:rPr>
+          <w:rFonts w:ascii="Arial" w:hAnsi="Arial"/>
+        </w:rPr>
+      </w:pPr>
+      <w:r>
+        <w:rPr>
+          <w:rFonts w:ascii="Arial" w:hAnsi="Arial"/>
+        </w:rPr>
+        <w:t>En primer lugar, de la fase de clasificación sin ajuste se espera obtener una línea de referencia cuantificable en términos de las métricas de evaluación seleccionadas (exactitud, F1-score y sensibilidad/especificidad, dado el contexto clínico de la tarea). Se anticipa que este desempeño, aunque por encima del azar, sea moderado, en la medida en que las representaciones de wav2vec 2.0 fueron aprendidas a partir de habla no patológica y no incorporan ningún mecanismo de especialización hacia los patrones acústicos asociados al deterioro cognitivo. Este resultado no busca ser sobresaliente en sí mismo, sino constituir el punto de comparación fijo frente al cual se evaluará el aporte real de cada estrategia de adaptación.</w:t>
+      </w:r>
+    </w:p>
+    <w:p>
+      <w:pPr>
+        <w:pStyle w:val="BodyText"/>
+        <w:rPr/>
+      </w:pPr>
+      <w:r>
+        <w:rPr>
+          <w:rFonts w:ascii="Arial" w:hAnsi="Arial"/>
+        </w:rPr>
+        <w:t xml:space="preserve">En segundo lugar, de la aplicación independiente de las cuatro estrategias de ajuste eficiente de parámetros </w:t>
+      </w:r>
+      <w:r>
+        <w:rPr>
+          <w:rFonts w:ascii="Arial" w:hAnsi="Arial"/>
+        </w:rPr>
+        <w:t>(</w:t>
+      </w:r>
+      <w:r>
+        <w:rPr>
+          <w:rFonts w:ascii="Arial" w:hAnsi="Arial"/>
+        </w:rPr>
+        <w:t xml:space="preserve">adaptadores tipo </w:t>
+      </w:r>
+      <w:r>
+        <w:rPr>
+          <w:rStyle w:val="Emphasis"/>
+          <w:rFonts w:ascii="Arial" w:hAnsi="Arial"/>
+        </w:rPr>
+        <w:t>bottleneck</w:t>
+      </w:r>
+      <w:r>
+        <w:rPr>
+          <w:rFonts w:ascii="Arial" w:hAnsi="Arial"/>
+        </w:rPr>
+        <w:t xml:space="preserve">, LoRA, </w:t>
+      </w:r>
+      <w:r>
+        <w:rPr>
+          <w:rStyle w:val="Emphasis"/>
+          <w:rFonts w:ascii="Arial" w:hAnsi="Arial"/>
+        </w:rPr>
+        <w:t>prefix-tuning</w:t>
+      </w:r>
+      <w:r>
+        <w:rPr>
+          <w:rFonts w:ascii="Arial" w:hAnsi="Arial"/>
+        </w:rPr>
+        <w:t xml:space="preserve"> y descongelamiento parcial de capas</w:t>
+      </w:r>
+      <w:r>
+        <w:rPr>
+          <w:rFonts w:ascii="Arial" w:hAnsi="Arial"/>
+        </w:rPr>
+        <w:t>)</w:t>
+      </w:r>
+      <w:r>
+        <w:rPr>
+          <w:rFonts w:ascii="Arial" w:hAnsi="Arial"/>
+        </w:rPr>
+        <w:t xml:space="preserve"> se espera caracterizar su aplicabilidad y su comportamiento particular sobre la arquitectura de wav2vec 2.0 en este escenario de datos clínicos escasos. No se anticipa que las cuatro estrategias se comporten de manera equivalente: es razonable esperar que estrategias con mayor capacidad de modificación de las representaciones internas (por ejemplo, el descongelamiento parcial de capas) obtengan ganancias de desempeño más notorias pero a un costo de parámetros entrenables considerablemente mayor, mientras que estrategias más restringidas (como </w:t>
+      </w:r>
+      <w:r>
+        <w:rPr>
+          <w:rStyle w:val="Emphasis"/>
+          <w:rFonts w:ascii="Arial" w:hAnsi="Arial"/>
+        </w:rPr>
+        <w:t>prefix-tuning</w:t>
+      </w:r>
+      <w:r>
+        <w:rPr>
+          <w:rFonts w:ascii="Arial" w:hAnsi="Arial"/>
+        </w:rPr>
+        <w:t>) podrían mostrar mejoras más modestas, en línea con lo reportado en la literatura sobre su menor flexibilidad en arquitecturas de habla en comparación con modelos de lenguaje. Esta heterogeneidad esperada es en sí misma un resultado relevante, pues permite identificar qué mecanismo de adaptación resulta más adecuado para este tipo de tarea y de dato.</w:t>
+      </w:r>
+    </w:p>
+    <w:p>
+      <w:pPr>
+        <w:pStyle w:val="BodyText"/>
+        <w:rPr>
+          <w:rFonts w:ascii="Arial" w:hAnsi="Arial"/>
+        </w:rPr>
+      </w:pPr>
+      <w:r>
+        <w:rPr>
+          <w:rFonts w:ascii="Arial" w:hAnsi="Arial"/>
+        </w:rPr>
+        <w:t xml:space="preserve">En tercer lugar, de la comparación conjunta entre el modelo base y las cuatro estrategias se espera establecer no solo cuál o cuáles estrategias superan a la línea base en desempeño de clasificación, sino también cuál ofrece la relación más favorable entre mejora de desempeño y costo computacional (parámetros entrenables, tiempo de entrenamiento e inferencia). Se espera que este análisis comparativo constituya el aporte metodológico central del trabajo, al proporcionar evidencia sobre la viabilidad de adaptar modelos fundacionales de habla a tareas clínicas </w:t>
+      </w:r>
+      <w:r>
+        <w:rPr>
+          <w:rFonts w:ascii="Arial" w:hAnsi="Arial"/>
+        </w:rPr>
+        <w:t>no invasivas</w:t>
+      </w:r>
+      <w:r>
+        <w:rPr>
+          <w:rFonts w:ascii="Arial" w:hAnsi="Arial"/>
+        </w:rPr>
+        <w:t>.</w:t>
+      </w:r>
+    </w:p>
+    <w:p>
+      <w:pPr>
+        <w:pStyle w:val="BodyText"/>
+        <w:rPr>
+          <w:rFonts w:ascii="Arial" w:hAnsi="Arial"/>
+        </w:rPr>
+      </w:pPr>
+      <w:commentRangeStart w:id="1"/>
+      <w:r>
+        <w:rPr>
+          <w:rFonts w:ascii="Arial" w:hAnsi="Arial"/>
+        </w:rPr>
+        <w:t>Finalmente, se espera que este trabajo contribuya a un área de investigación aún escasamente explorada: la intersección entre PEFT, modelos de habla auto-supervisados y clasificación de enfermedades neurodegenerativas. Dado que las corpus experimentales utilizados están en inglés, los resultados obtenidos deben entenderse como una validación metodológica de las estrategias evaluadas más que como una conclusión directa sobre su desempeño en habla en español; no obstante, se espera que esta validación siente una base metodológica replicable para trabajos futuros orientados a corpus de habla clínica en español, incluyendo eventualmente el contexto colombiano que motiva este trabajo.</w:t>
+      </w:r>
+      <w:commentRangeEnd w:id="1"/>
+      <w:r>
+        <w:commentReference w:id="1"/>
+      </w:r>
+      <w:r>
+        <w:rPr>
+          <w:rFonts w:ascii="Arial" w:hAnsi="Arial"/>
+        </w:rPr>
+      </w:r>
+    </w:p>
+    <w:p>
+      <w:pPr>
+        <w:pStyle w:val="normal1"/>
+        <w:jc w:val="both"/>
+        <w:rPr>
+          <w:rFonts w:ascii="Arial" w:hAnsi="Arial"/>
+        </w:rPr>
+      </w:pPr>
+      <w:r>
+        <w:rPr>
+          <w:rFonts w:ascii="Arial" w:hAnsi="Arial"/>
+        </w:rPr>
+      </w:r>
+    </w:p>
+    <w:p>
+      <w:pPr>
+        <w:pStyle w:val="normal1"/>
+        <w:jc w:val="both"/>
+        <w:rPr>
+          <w:rFonts w:ascii="Arial" w:hAnsi="Arial"/>
+        </w:rPr>
+      </w:pPr>
+      <w:r>
+        <w:rPr>
+          <w:rFonts w:ascii="Arial" w:hAnsi="Arial"/>
+        </w:rPr>
+      </w:r>
+    </w:p>
+    <w:p>
+      <w:pPr>
+        <w:pStyle w:val="normal1"/>
+        <w:jc w:val="both"/>
+        <w:rPr>
+          <w:rFonts w:ascii="Arial" w:hAnsi="Arial"/>
+        </w:rPr>
+      </w:pPr>
+      <w:r>
+        <w:rPr>
+          <w:rFonts w:eastAsia="Arial" w:cs="Arial" w:ascii="Arial" w:hAnsi="Arial"/>
+          <w:b/>
+          <w:bCs/>
+          <w:position w:val="0"/>
+          <w:sz w:val="24"/>
+          <w:sz w:val="24"/>
+          <w:szCs w:val="24"/>
+          <w:vertAlign w:val="baseline"/>
+        </w:rPr>
+        <w:t>Presupuesto</w:t>
+      </w:r>
+    </w:p>
+    <w:p>
+      <w:pPr>
+        <w:pStyle w:val="normal1"/>
+        <w:jc w:val="both"/>
+        <w:rPr>
+          <w:rFonts w:ascii="Arial" w:hAnsi="Arial"/>
         </w:rPr>
       </w:pPr>
       <w:r>
@@ -8032,7 +7930,7 @@
           <w:szCs w:val="24"/>
           <w:vertAlign w:val="baseline"/>
         </w:rPr>
-        <w:t xml:space="preserve">Se presenta lo que se espera alcanzar con la realización del trabajo. </w:t>
+        <w:t>Se describen los recursos necesarios para la realización del proyecto (gastos en personal, gastos en equipos o análisis, gastos en materiales o insumos).</w:t>
       </w:r>
     </w:p>
     <w:p>
@@ -8071,8 +7969,6 @@
         <w:jc w:val="both"/>
         <w:rPr>
           <w:rFonts w:ascii="Arial" w:hAnsi="Arial"/>
-          <w:sz w:val="24"/>
-          <w:szCs w:val="24"/>
         </w:rPr>
       </w:pPr>
       <w:r>
@@ -8086,7 +7982,7 @@
           <w:szCs w:val="24"/>
           <w:vertAlign w:val="baseline"/>
         </w:rPr>
-        <w:t>Presupuesto</w:t>
+        <w:t>Referencias bibliográficas</w:t>
       </w:r>
     </w:p>
     <w:p>
@@ -8095,8 +7991,6 @@
         <w:jc w:val="both"/>
         <w:rPr>
           <w:rFonts w:ascii="Arial" w:hAnsi="Arial"/>
-          <w:sz w:val="24"/>
-          <w:szCs w:val="24"/>
         </w:rPr>
       </w:pPr>
       <w:r>
@@ -8109,7 +8003,7 @@
           <w:szCs w:val="24"/>
           <w:vertAlign w:val="baseline"/>
         </w:rPr>
-        <w:t>Se describen los recursos necesarios para la realización del proyecto (gastos en personal, gastos en equipos o análisis, gastos en materiales o insumos).</w:t>
+        <w:t xml:space="preserve">Se referencian adecuadamente los autores y publicaciones citados en este proyecto de acuerdo con la Norma Técnica Colombiana. </w:t>
       </w:r>
     </w:p>
     <w:p>
@@ -8148,8 +8042,6 @@
         <w:jc w:val="both"/>
         <w:rPr>
           <w:rFonts w:ascii="Arial" w:hAnsi="Arial"/>
-          <w:sz w:val="24"/>
-          <w:szCs w:val="24"/>
         </w:rPr>
       </w:pPr>
       <w:r>
@@ -8163,7 +8055,7 @@
           <w:szCs w:val="24"/>
           <w:vertAlign w:val="baseline"/>
         </w:rPr>
-        <w:t>Referencias bibliográficas</w:t>
+        <w:t xml:space="preserve">Visto bueno del asesor interno </w:t>
       </w:r>
     </w:p>
     <w:p>
@@ -8172,85 +8064,6 @@
         <w:jc w:val="both"/>
         <w:rPr>
           <w:rFonts w:ascii="Arial" w:hAnsi="Arial"/>
-          <w:sz w:val="24"/>
-          <w:szCs w:val="24"/>
-        </w:rPr>
-      </w:pPr>
-      <w:r>
-        <w:rPr>
-          <w:rFonts w:eastAsia="Arial" w:cs="Arial" w:ascii="Arial" w:hAnsi="Arial"/>
-          <w:color w:val="7F7F7F"/>
-          <w:position w:val="0"/>
-          <w:sz w:val="24"/>
-          <w:sz w:val="24"/>
-          <w:szCs w:val="24"/>
-          <w:vertAlign w:val="baseline"/>
-        </w:rPr>
-        <w:t xml:space="preserve">Se referencian adecuadamente los autores y publicaciones citados en este proyecto de acuerdo con la Norma Técnica Colombiana. </w:t>
-      </w:r>
-    </w:p>
-    <w:p>
-      <w:pPr>
-        <w:pStyle w:val="normal1"/>
-        <w:jc w:val="both"/>
-        <w:rPr>
-          <w:rFonts w:ascii="Arial" w:hAnsi="Arial" w:eastAsia="Arial" w:cs="Arial"/>
-          <w:b/>
-          <w:bCs/>
-          <w:color w:val="7F7F7F"/>
-          <w:position w:val="0"/>
-          <w:sz w:val="24"/>
-          <w:sz w:val="24"/>
-          <w:szCs w:val="24"/>
-          <w:vertAlign w:val="baseline"/>
-        </w:rPr>
-      </w:pPr>
-      <w:r>
-        <w:rPr>
-          <w:rFonts w:eastAsia="Arial" w:cs="Arial" w:ascii="Arial" w:hAnsi="Arial"/>
-          <w:b/>
-          <w:bCs/>
-          <w:color w:val="7F7F7F"/>
-          <w:position w:val="0"/>
-          <w:sz w:val="24"/>
-          <w:sz w:val="24"/>
-          <w:szCs w:val="24"/>
-          <w:vertAlign w:val="baseline"/>
-        </w:rPr>
-      </w:r>
-    </w:p>
-    <w:p>
-      <w:pPr>
-        <w:pStyle w:val="normal1"/>
-        <w:jc w:val="both"/>
-        <w:rPr>
-          <w:rFonts w:ascii="Arial" w:hAnsi="Arial"/>
-          <w:sz w:val="24"/>
-          <w:szCs w:val="24"/>
-        </w:rPr>
-      </w:pPr>
-      <w:r>
-        <w:rPr>
-          <w:rFonts w:eastAsia="Arial" w:cs="Arial" w:ascii="Arial" w:hAnsi="Arial"/>
-          <w:b/>
-          <w:bCs/>
-          <w:position w:val="0"/>
-          <w:sz w:val="24"/>
-          <w:sz w:val="24"/>
-          <w:szCs w:val="24"/>
-          <w:vertAlign w:val="baseline"/>
-        </w:rPr>
-        <w:t xml:space="preserve">Visto bueno del asesor interno </w:t>
-      </w:r>
-    </w:p>
-    <w:p>
-      <w:pPr>
-        <w:pStyle w:val="normal1"/>
-        <w:jc w:val="both"/>
-        <w:rPr>
-          <w:rFonts w:ascii="Arial" w:hAnsi="Arial"/>
-          <w:sz w:val="24"/>
-          <w:szCs w:val="24"/>
         </w:rPr>
       </w:pPr>
       <w:r>
@@ -8335,7 +8148,7 @@
         <mc:AlternateContent>
           <mc:Choice Requires="wps">
             <w:drawing>
-              <wp:anchor behindDoc="0" distT="0" distB="0" distL="0" distR="0" simplePos="0" locked="0" layoutInCell="1" allowOverlap="1" relativeHeight="13">
+              <wp:anchor behindDoc="0" distT="5080" distB="5715" distL="1270" distR="635" simplePos="0" locked="0" layoutInCell="1" allowOverlap="1" relativeHeight="28">
                 <wp:simplePos x="0" y="0"/>
                 <wp:positionH relativeFrom="column">
                   <wp:posOffset>3776345</wp:posOffset>
@@ -8346,7 +8159,7 @@
                 <wp:extent cx="1915795" cy="12700"/>
                 <wp:effectExtent l="1270" t="5080" r="635" b="5715"/>
                 <wp:wrapNone/>
-                <wp:docPr id="2" name="Shape2"/>
+                <wp:docPr id="3" name="Shape2"/>
                 <a:graphic xmlns:a="http://schemas.openxmlformats.org/drawingml/2006/main">
                   <a:graphicData uri="http://schemas.microsoft.com/office/word/2010/wordprocessingShape">
                     <wps:wsp>
@@ -8397,7 +8210,7 @@
         <mc:AlternateContent>
           <mc:Choice Requires="wps">
             <w:drawing>
-              <wp:anchor behindDoc="0" distT="0" distB="0" distL="0" distR="0" simplePos="0" locked="0" layoutInCell="1" allowOverlap="1" relativeHeight="25">
+              <wp:anchor behindDoc="0" distT="5080" distB="5715" distL="1270" distR="635" simplePos="0" locked="0" layoutInCell="1" allowOverlap="1" relativeHeight="29">
                 <wp:simplePos x="0" y="0"/>
                 <wp:positionH relativeFrom="column">
                   <wp:posOffset>23495</wp:posOffset>
@@ -8408,7 +8221,7 @@
                 <wp:extent cx="1915795" cy="12700"/>
                 <wp:effectExtent l="1270" t="5080" r="635" b="5715"/>
                 <wp:wrapNone/>
-                <wp:docPr id="3" name="Shape1"/>
+                <wp:docPr id="4" name="Shape1"/>
                 <a:graphic xmlns:a="http://schemas.openxmlformats.org/drawingml/2006/main">
                   <a:graphicData uri="http://schemas.microsoft.com/office/word/2010/wordprocessingShape">
                     <wps:wsp>
@@ -8459,8 +8272,6 @@
         <w:pStyle w:val="normal1"/>
         <w:rPr>
           <w:rFonts w:ascii="Arial" w:hAnsi="Arial"/>
-          <w:sz w:val="24"/>
-          <w:szCs w:val="24"/>
         </w:rPr>
       </w:pPr>
       <w:r>
@@ -8485,8 +8296,6 @@
         <w:pStyle w:val="normal1"/>
         <w:rPr>
           <w:rFonts w:ascii="Arial" w:hAnsi="Arial"/>
-          <w:sz w:val="24"/>
-          <w:szCs w:val="24"/>
         </w:rPr>
       </w:pPr>
       <w:r>
@@ -8607,8 +8416,6 @@
         <w:jc w:val="both"/>
         <w:rPr>
           <w:rFonts w:ascii="Arial" w:hAnsi="Arial"/>
-          <w:sz w:val="24"/>
-          <w:szCs w:val="24"/>
         </w:rPr>
       </w:pPr>
       <w:r>
@@ -8636,8 +8443,6 @@
         <w:jc w:val="both"/>
         <w:rPr>
           <w:rFonts w:ascii="Arial" w:hAnsi="Arial"/>
-          <w:sz w:val="24"/>
-          <w:szCs w:val="24"/>
         </w:rPr>
       </w:pPr>
       <w:bookmarkStart w:id="4" w:name="_d6ssffjsw8tn"/>
@@ -8667,8 +8472,6 @@
         <w:jc w:val="both"/>
         <w:rPr>
           <w:rFonts w:ascii="Arial" w:hAnsi="Arial"/>
-          <w:sz w:val="24"/>
-          <w:szCs w:val="24"/>
         </w:rPr>
       </w:pPr>
       <w:r>
@@ -8692,7 +8495,6 @@
         <w:keepLines w:val="false"/>
         <w:pageBreakBefore w:val="false"/>
         <w:widowControl/>
-        <w:pBdr/>
         <w:shd w:val="clear" w:fill="auto"/>
         <w:spacing w:lineRule="auto" w:line="240" w:before="0" w:after="0"/>
         <w:ind w:hanging="0" w:left="720" w:right="0"/>
@@ -8748,8 +8550,6 @@
         <w:jc w:val="both"/>
         <w:rPr>
           <w:rFonts w:ascii="Arial" w:hAnsi="Arial"/>
-          <w:sz w:val="24"/>
-          <w:szCs w:val="24"/>
         </w:rPr>
       </w:pPr>
       <w:r>
@@ -8772,8 +8572,6 @@
         <w:ind w:hanging="0" w:left="708" w:right="0"/>
         <w:rPr>
           <w:rFonts w:ascii="Arial" w:hAnsi="Arial"/>
-          <w:sz w:val="24"/>
-          <w:szCs w:val="24"/>
         </w:rPr>
       </w:pPr>
       <w:r>
@@ -8794,8 +8592,6 @@
         <w:ind w:hanging="0" w:left="708" w:right="0"/>
         <w:rPr>
           <w:rFonts w:ascii="Arial" w:hAnsi="Arial"/>
-          <w:sz w:val="24"/>
-          <w:szCs w:val="24"/>
         </w:rPr>
       </w:pPr>
       <w:r>
@@ -8816,8 +8612,6 @@
         <w:ind w:hanging="0" w:left="708" w:right="0"/>
         <w:rPr>
           <w:rFonts w:ascii="Arial" w:hAnsi="Arial"/>
-          <w:sz w:val="24"/>
-          <w:szCs w:val="24"/>
         </w:rPr>
       </w:pPr>
       <w:r>
@@ -8838,8 +8632,6 @@
         <w:ind w:hanging="0" w:left="708" w:right="0"/>
         <w:rPr>
           <w:rFonts w:ascii="Arial" w:hAnsi="Arial"/>
-          <w:sz w:val="24"/>
-          <w:szCs w:val="24"/>
         </w:rPr>
       </w:pPr>
       <w:r>
@@ -8860,8 +8652,6 @@
         <w:ind w:hanging="0" w:left="708" w:right="0"/>
         <w:rPr>
           <w:rFonts w:ascii="Arial" w:hAnsi="Arial"/>
-          <w:sz w:val="24"/>
-          <w:szCs w:val="24"/>
         </w:rPr>
       </w:pPr>
       <w:r>
@@ -8883,7 +8673,6 @@
         <w:keepLines w:val="false"/>
         <w:pageBreakBefore w:val="false"/>
         <w:widowControl/>
-        <w:pBdr/>
         <w:shd w:val="clear" w:fill="auto"/>
         <w:spacing w:lineRule="auto" w:line="240" w:before="0" w:after="0"/>
         <w:ind w:hanging="0" w:left="791" w:right="0"/>
@@ -8997,12 +8786,7 @@
     <w:p>
       <w:pPr>
         <w:pStyle w:val="Normal"/>
-        <w:rPr>
-          <w:rFonts w:ascii="Century Gothic" w:hAnsi="Century Gothic" w:eastAsia="Century Gothic" w:cs="Century Gothic"/>
-          <w:position w:val="0"/>
-          <w:sz w:val="24"/>
-          <w:vertAlign w:val="baseline"/>
-        </w:rPr>
+        <w:rPr/>
       </w:pPr>
       <w:r>
         <w:rPr>
@@ -9060,7 +8844,7 @@
         <w:br/>
         <w:t xml:space="preserve">Enlace: </w:t>
       </w:r>
-      <w:hyperlink r:id="rId3">
+      <w:hyperlink r:id="rId4">
         <w:r>
           <w:rPr>
             <w:rStyle w:val="Hyperlink"/>
@@ -9107,12 +8891,7 @@
     <w:p>
       <w:pPr>
         <w:pStyle w:val="BodyText"/>
-        <w:rPr>
-          <w:rFonts w:ascii="Century Gothic" w:hAnsi="Century Gothic" w:eastAsia="Century Gothic" w:cs="Century Gothic"/>
-          <w:position w:val="0"/>
-          <w:sz w:val="24"/>
-          <w:vertAlign w:val="baseline"/>
-        </w:rPr>
+        <w:rPr/>
       </w:pPr>
       <w:r>
         <w:rPr>
@@ -9154,7 +8933,7 @@
         </w:rPr>
         <w:t xml:space="preserve">. Periódico UNAL. Enlace: </w:t>
       </w:r>
-      <w:hyperlink r:id="rId4">
+      <w:hyperlink r:id="rId5">
         <w:r>
           <w:rPr>
             <w:rStyle w:val="Hyperlink"/>
@@ -9174,12 +8953,7 @@
     <w:p>
       <w:pPr>
         <w:pStyle w:val="BodyText"/>
-        <w:rPr>
-          <w:rFonts w:ascii="Century Gothic" w:hAnsi="Century Gothic" w:eastAsia="Century Gothic" w:cs="Century Gothic"/>
-          <w:position w:val="0"/>
-          <w:sz w:val="24"/>
-          <w:vertAlign w:val="baseline"/>
-        </w:rPr>
+        <w:rPr/>
       </w:pPr>
       <w:r>
         <w:rPr>
@@ -9237,7 +9011,7 @@
         <w:br/>
         <w:t xml:space="preserve">Enlace: </w:t>
       </w:r>
-      <w:hyperlink r:id="rId5">
+      <w:hyperlink r:id="rId6">
         <w:r>
           <w:rPr>
             <w:rStyle w:val="Hyperlink"/>
@@ -9303,19 +9077,17 @@
         <w:br/>
         <w:t xml:space="preserve">Enlace: </w:t>
       </w:r>
-      <w:hyperlink r:id="rId7">
-        <w:r>
-          <w:rPr>
-            <w:rStyle w:val="Hyperlink"/>
-            <w:rFonts w:ascii="Arial" w:hAnsi="Arial"/>
-            <w:b w:val="false"/>
-            <w:bCs w:val="false"/>
-            <w:sz w:val="24"/>
-            <w:szCs w:val="24"/>
-          </w:rPr>
-          <w:t>https://doi.org/10.3233/JAD-240360</w:t>
-        </w:r>
-      </w:hyperlink>
+      <w:r>
+        <w:rPr>
+          <w:rStyle w:val="Hyperlink"/>
+          <w:rFonts w:ascii="Arial" w:hAnsi="Arial"/>
+          <w:b w:val="false"/>
+          <w:bCs w:val="false"/>
+          <w:sz w:val="24"/>
+          <w:szCs w:val="24"/>
+        </w:rPr>
+        <w:t>https://doi.org/10.3233/JAD-240360</w:t>
+      </w:r>
     </w:p>
     <w:p>
       <w:pPr>
@@ -9323,6 +9095,7 @@
         <w:spacing w:lineRule="auto" w:line="480"/>
         <w:ind w:hanging="0" w:left="0" w:right="0"/>
         <w:rPr>
+          <w:rFonts w:ascii="Arial" w:hAnsi="Arial"/>
           <w:b w:val="false"/>
           <w:bCs w:val="false"/>
         </w:rPr>
@@ -9330,8 +9103,8 @@
       <w:r>
         <w:rPr>
           <w:rFonts w:ascii="Arial" w:hAnsi="Arial"/>
-          <w:sz w:val="24"/>
-          <w:szCs w:val="24"/>
+          <w:b w:val="false"/>
+          <w:bCs w:val="false"/>
         </w:rPr>
       </w:r>
     </w:p>
@@ -9350,17 +9123,7 @@
           <w:sz w:val="24"/>
           <w:szCs w:val="24"/>
         </w:rPr>
-        <w:t xml:space="preserve">[5] </w:t>
-      </w:r>
-      <w:r>
-        <w:rPr>
-          <w:rFonts w:ascii="Arial" w:hAnsi="Arial"/>
-          <w:b w:val="false"/>
-          <w:bCs w:val="false"/>
-          <w:sz w:val="24"/>
-          <w:szCs w:val="24"/>
-        </w:rPr>
-        <w:t xml:space="preserve">Vigo, I., Coelho, L., &amp; Reis, S. (2022). Speech- and Language-Based Classification of Alzheimer’s Disease: A Systematic Review. </w:t>
+        <w:t xml:space="preserve">[5] Vigo, I., Coelho, L., &amp; Reis, S. (2022). Speech- and Language-Based Classification of Alzheimer’s Disease: A Systematic Review. </w:t>
       </w:r>
       <w:r>
         <w:rPr>
@@ -9404,7 +9167,7 @@
         </w:rPr>
         <w:t xml:space="preserve">(1), 27. </w:t>
       </w:r>
-      <w:hyperlink r:id="rId8">
+      <w:hyperlink r:id="rId7">
         <w:r>
           <w:rPr>
             <w:rStyle w:val="Hyperlink"/>
@@ -9421,12 +9184,7 @@
     <w:p>
       <w:pPr>
         <w:pStyle w:val="Normal"/>
-        <w:rPr>
-          <w:rFonts w:ascii="Century Gothic" w:hAnsi="Century Gothic" w:eastAsia="Century Gothic" w:cs="Century Gothic"/>
-          <w:position w:val="0"/>
-          <w:sz w:val="24"/>
-          <w:vertAlign w:val="baseline"/>
-        </w:rPr>
+        <w:rPr/>
       </w:pPr>
       <w:r>
         <w:rPr>
@@ -9437,18 +9195,7 @@
           <w:szCs w:val="24"/>
           <w:vertAlign w:val="baseline"/>
         </w:rPr>
-        <w:t>[6]</w:t>
-      </w:r>
-      <w:r>
-        <w:rPr>
-          <w:rFonts w:eastAsia="Century Gothic" w:cs="Century Gothic" w:ascii="Arial" w:hAnsi="Arial"/>
-          <w:position w:val="0"/>
-          <w:sz w:val="24"/>
-          <w:sz w:val="24"/>
-          <w:szCs w:val="24"/>
-          <w:vertAlign w:val="baseline"/>
-        </w:rPr>
-        <w:t xml:space="preserve">Baevski, A., Zhou, H., Mohamed, A., &amp; Auli, M. (2020). </w:t>
+        <w:t xml:space="preserve">[6]Baevski, A., Zhou, H., Mohamed, A., &amp; Auli, M. (2020). </w:t>
       </w:r>
       <w:r>
         <w:rPr>
@@ -9473,7 +9220,7 @@
         </w:rPr>
         <w:t xml:space="preserve"> (arXiv:2006.11477). arXiv. </w:t>
       </w:r>
-      <w:hyperlink r:id="rId9">
+      <w:hyperlink r:id="rId8">
         <w:r>
           <w:rPr>
             <w:rStyle w:val="Hyperlink"/>
@@ -9518,15 +9265,7 @@
           <w:sz w:val="24"/>
           <w:szCs w:val="24"/>
         </w:rPr>
-        <w:t>[7]</w:t>
-      </w:r>
-      <w:r>
-        <w:rPr>
-          <w:rFonts w:ascii="Arial" w:hAnsi="Arial"/>
-          <w:sz w:val="24"/>
-          <w:szCs w:val="24"/>
-        </w:rPr>
-        <w:t xml:space="preserve">Luz, S., Haider, F., Fuente, S. de la, Fromm, D., &amp; MacWhinney, B. (2020). </w:t>
+        <w:t xml:space="preserve">[7]Luz, S., Haider, F., Fuente, S. de la, Fromm, D., &amp; MacWhinney, B. (2020). </w:t>
       </w:r>
       <w:r>
         <w:rPr>
@@ -9545,7 +9284,7 @@
         </w:rPr>
         <w:t xml:space="preserve"> (arXiv:2004.06833). arXiv. </w:t>
       </w:r>
-      <w:hyperlink r:id="rId10">
+      <w:hyperlink r:id="rId9">
         <w:r>
           <w:rPr>
             <w:rStyle w:val="Hyperlink"/>
@@ -9569,15 +9308,7 @@
           <w:sz w:val="24"/>
           <w:szCs w:val="24"/>
         </w:rPr>
-        <w:t>[8]</w:t>
-      </w:r>
-      <w:r>
-        <w:rPr>
-          <w:rFonts w:ascii="Arial" w:hAnsi="Arial"/>
-          <w:sz w:val="24"/>
-          <w:szCs w:val="24"/>
-        </w:rPr>
-        <w:t xml:space="preserve">Luz, S., Haider, F., Fuente, S. de la, Fromm, D., &amp; MacWhinney, B. (2021). </w:t>
+        <w:t xml:space="preserve">[8]Luz, S., Haider, F., Fuente, S. de la, Fromm, D., &amp; MacWhinney, B. (2021). </w:t>
       </w:r>
       <w:r>
         <w:rPr>
@@ -9596,7 +9327,7 @@
         </w:rPr>
         <w:t xml:space="preserve"> (arXiv:2104.09356). arXiv. </w:t>
       </w:r>
-      <w:hyperlink r:id="rId11">
+      <w:hyperlink r:id="rId10">
         <w:r>
           <w:rPr>
             <w:rStyle w:val="Hyperlink"/>
@@ -9611,12 +9342,7 @@
     <w:p>
       <w:pPr>
         <w:pStyle w:val="Normal"/>
-        <w:rPr>
-          <w:rFonts w:ascii="Century Gothic" w:hAnsi="Century Gothic" w:eastAsia="Century Gothic" w:cs="Century Gothic"/>
-          <w:position w:val="0"/>
-          <w:sz w:val="24"/>
-          <w:vertAlign w:val="baseline"/>
-        </w:rPr>
+        <w:rPr/>
       </w:pPr>
       <w:r>
         <w:rPr>
@@ -9627,18 +9353,7 @@
           <w:szCs w:val="24"/>
           <w:vertAlign w:val="baseline"/>
         </w:rPr>
-        <w:t>[9]</w:t>
-      </w:r>
-      <w:r>
-        <w:rPr>
-          <w:rFonts w:eastAsia="Century Gothic" w:cs="Century Gothic" w:ascii="Arial" w:hAnsi="Arial"/>
-          <w:position w:val="0"/>
-          <w:sz w:val="24"/>
-          <w:sz w:val="24"/>
-          <w:szCs w:val="24"/>
-          <w:vertAlign w:val="baseline"/>
-        </w:rPr>
-        <w:t xml:space="preserve">Houlsby, N., Giurgiu, A., Jastrzebski, S., Morrone, B., Laroussilhe, Q. de, Gesmundo, A., Attariyan, M., &amp; Gelly, S. (2019). </w:t>
+        <w:t xml:space="preserve">[9]Houlsby, N., Giurgiu, A., Jastrzebski, S., Morrone, B., Laroussilhe, Q. de, Gesmundo, A., Attariyan, M., &amp; Gelly, S. (2019). </w:t>
       </w:r>
       <w:r>
         <w:rPr>
@@ -9663,7 +9378,7 @@
         </w:rPr>
         <w:t xml:space="preserve"> (arXiv:1902.00751). arXiv. </w:t>
       </w:r>
-      <w:hyperlink r:id="rId12">
+      <w:hyperlink r:id="rId11">
         <w:r>
           <w:rPr>
             <w:rStyle w:val="Hyperlink"/>
@@ -9708,15 +9423,7 @@
           <w:sz w:val="24"/>
           <w:szCs w:val="24"/>
         </w:rPr>
-        <w:t>[10]</w:t>
-      </w:r>
-      <w:r>
-        <w:rPr>
-          <w:rFonts w:ascii="Arial" w:hAnsi="Arial"/>
-          <w:sz w:val="24"/>
-          <w:szCs w:val="24"/>
-        </w:rPr>
-        <w:t xml:space="preserve">Hu, E. J., Shen, Y., Wallis, P., Allen-Zhu, Z., Li, Y., Wang, S., Wang, L., &amp; Chen, W. (2021). </w:t>
+        <w:t xml:space="preserve">[10]Hu, E. J., Shen, Y., Wallis, P., Allen-Zhu, Z., Li, Y., Wang, S., Wang, L., &amp; Chen, W. (2021). </w:t>
       </w:r>
       <w:r>
         <w:rPr>
@@ -9735,7 +9442,7 @@
         </w:rPr>
         <w:t xml:space="preserve"> (arXiv:2106.09685). arXiv. </w:t>
       </w:r>
-      <w:hyperlink r:id="rId13">
+      <w:hyperlink r:id="rId12">
         <w:r>
           <w:rPr>
             <w:rStyle w:val="Hyperlink"/>
@@ -9759,15 +9466,7 @@
           <w:sz w:val="24"/>
           <w:szCs w:val="24"/>
         </w:rPr>
-        <w:t>[11]</w:t>
-      </w:r>
-      <w:r>
-        <w:rPr>
-          <w:rFonts w:ascii="Arial" w:hAnsi="Arial"/>
-          <w:sz w:val="24"/>
-          <w:szCs w:val="24"/>
-        </w:rPr>
-        <w:t xml:space="preserve">Li, X. L., &amp; Liang, P. (2021). </w:t>
+        <w:t xml:space="preserve">[11]Li, X. L., &amp; Liang, P. (2021). </w:t>
       </w:r>
       <w:r>
         <w:rPr>
@@ -9786,7 +9485,7 @@
         </w:rPr>
         <w:t xml:space="preserve"> (arXiv:2101.00190). arXiv. </w:t>
       </w:r>
-      <w:hyperlink r:id="rId14">
+      <w:hyperlink r:id="rId13">
         <w:r>
           <w:rPr>
             <w:rStyle w:val="Hyperlink"/>
@@ -9801,12 +9500,7 @@
     <w:p>
       <w:pPr>
         <w:pStyle w:val="Normal"/>
-        <w:rPr>
-          <w:rFonts w:ascii="Century Gothic" w:hAnsi="Century Gothic" w:eastAsia="Century Gothic" w:cs="Century Gothic"/>
-          <w:position w:val="0"/>
-          <w:sz w:val="24"/>
-          <w:vertAlign w:val="baseline"/>
-        </w:rPr>
+        <w:rPr/>
       </w:pPr>
       <w:r>
         <w:rPr>
@@ -9817,18 +9511,7 @@
           <w:szCs w:val="24"/>
           <w:vertAlign w:val="baseline"/>
         </w:rPr>
-        <w:t>[12]</w:t>
-      </w:r>
-      <w:r>
-        <w:rPr>
-          <w:rFonts w:eastAsia="Century Gothic" w:cs="Century Gothic" w:ascii="Arial" w:hAnsi="Arial"/>
-          <w:position w:val="0"/>
-          <w:sz w:val="24"/>
-          <w:sz w:val="24"/>
-          <w:szCs w:val="24"/>
-          <w:vertAlign w:val="baseline"/>
-        </w:rPr>
-        <w:t xml:space="preserve">Park, D. S., Chan, W., Zhang, Y., Chiu, C.-C., Zoph, B., Cubuk, E. D., &amp; Le, Q. V. (2019). SpecAugment: A Simple Data Augmentation Method for Automatic Speech Recognition. </w:t>
+        <w:t xml:space="preserve">[12]Park, D. S., Chan, W., Zhang, Y., Chiu, C.-C., Zoph, B., Cubuk, E. D., &amp; Le, Q. V. (2019). SpecAugment: A Simple Data Augmentation Method for Automatic Speech Recognition. </w:t>
       </w:r>
       <w:r>
         <w:rPr>
@@ -9853,7 +9536,7 @@
         </w:rPr>
         <w:t xml:space="preserve">, 2613–2617. </w:t>
       </w:r>
-      <w:hyperlink r:id="rId15">
+      <w:hyperlink r:id="rId14">
         <w:r>
           <w:rPr>
             <w:rStyle w:val="Hyperlink"/>
@@ -9892,12 +9575,12 @@
       </w:r>
     </w:p>
     <w:sectPr>
-      <w:headerReference w:type="even" r:id="rId16"/>
-      <w:headerReference w:type="default" r:id="rId17"/>
-      <w:headerReference w:type="first" r:id="rId18"/>
-      <w:footerReference w:type="even" r:id="rId19"/>
-      <w:footerReference w:type="default" r:id="rId20"/>
-      <w:footerReference w:type="first" r:id="rId21"/>
+      <w:headerReference w:type="even" r:id="rId15"/>
+      <w:headerReference w:type="default" r:id="rId16"/>
+      <w:headerReference w:type="first" r:id="rId17"/>
+      <w:footerReference w:type="even" r:id="rId18"/>
+      <w:footerReference w:type="default" r:id="rId19"/>
+      <w:footerReference w:type="first" r:id="rId20"/>
       <w:type w:val="nextPage"/>
       <w:pgSz w:w="11906" w:h="16838"/>
       <w:pgMar w:left="1418" w:right="1418" w:gutter="0" w:header="709" w:top="1843" w:footer="709" w:bottom="1276"/>
@@ -9912,7 +9595,7 @@
 
 <file path=word/comments.xml><?xml version="1.0" encoding="utf-8"?>
 <w:comments xmlns:o="urn:schemas-microsoft-com:office:office" xmlns:r="http://schemas.openxmlformats.org/officeDocument/2006/relationships" xmlns:v="urn:schemas-microsoft-com:vml" xmlns:w="http://schemas.openxmlformats.org/wordprocessingml/2006/main" xmlns:w10="urn:schemas-microsoft-com:office:word" xmlns:wp="http://schemas.openxmlformats.org/drawingml/2006/wordprocessingDrawing" xmlns:wps="http://schemas.microsoft.com/office/word/2010/wordprocessingShape" xmlns:wpg="http://schemas.microsoft.com/office/word/2010/wordprocessingGroup" xmlns:mc="http://schemas.openxmlformats.org/markup-compatibility/2006" xmlns:wp14="http://schemas.microsoft.com/office/word/2010/wordprocessingDrawing" xmlns:w14="http://schemas.microsoft.com/office/word/2010/wordml" xmlns:w15="http://schemas.microsoft.com/office/word/2012/wordml" mc:Ignorable="w14 wp14 w15">
-  <w:comment w:id="0" w:author="Unknown Author" w:date="2026-07-09T20:48:30Z" w:initials="">
+  <w:comment w:id="0" w:author="Unknown Author" w:date="2026-07-10T20:45:21Z" w:initials="">
     <w:p>
       <w:pPr>
         <w:overflowPunct w:val="false"/>
@@ -9923,7 +9606,7 @@
           <w:rFonts w:ascii="Liberation Serif" w:hAnsi="Liberation Serif" w:eastAsia="DejaVu Sans" w:cs="Noto Sans Arabic UI"/>
           <w:lang w:val="en-US" w:eastAsia="en-US" w:bidi="en-US"/>
         </w:rPr>
-        <w:t>Expandir</w:t>
+        <w:t>Esto medio me parece una tarea</w:t>
       </w:r>
     </w:p>
     <w:p>
@@ -9936,6 +9619,21 @@
           <w:rFonts w:ascii="Liberation Serif" w:hAnsi="Liberation Serif" w:eastAsia="DejaVu Sans" w:cs="Noto Sans Arabic UI"/>
           <w:lang w:val="en-US" w:eastAsia="en-US" w:bidi="en-US"/>
         </w:rPr>
+      </w:r>
+    </w:p>
+  </w:comment>
+  <w:comment w:id="1" w:author="Unknown Author" w:date="2026-07-10T20:38:29Z" w:initials="">
+    <w:p>
+      <w:pPr>
+        <w:overflowPunct w:val="false"/>
+        <w:rPr/>
+      </w:pPr>
+      <w:r>
+        <w:rPr>
+          <w:rFonts w:ascii="Liberation Serif" w:hAnsi="Liberation Serif" w:eastAsia="DejaVu Sans" w:cs="Noto Sans Arabic UI"/>
+          <w:lang w:val="en-US" w:eastAsia="en-US" w:bidi="en-US"/>
+        </w:rPr>
+        <w:t>Esto para justificar el primer parrafo de la introducción</w:t>
       </w:r>
     </w:p>
   </w:comment>
@@ -9965,91 +9663,6 @@
       <w:keepLines w:val="false"/>
       <w:pageBreakBefore w:val="false"/>
       <w:widowControl/>
-      <w:pBdr/>
-      <w:shd w:val="clear" w:fill="auto"/>
-      <w:tabs>
-        <w:tab w:val="clear" w:pos="720"/>
-        <w:tab w:val="center" w:pos="4252" w:leader="none"/>
-        <w:tab w:val="right" w:pos="8504" w:leader="none"/>
-      </w:tabs>
-      <w:spacing w:lineRule="auto" w:line="240" w:before="0" w:after="0"/>
-      <w:ind w:hanging="0" w:left="0" w:right="0"/>
-      <w:jc w:val="left"/>
-      <w:rPr>
-        <w:rFonts w:ascii="Times New Roman" w:hAnsi="Times New Roman" w:eastAsia="Times New Roman" w:cs="Times New Roman"/>
-        <w:b w:val="false"/>
-        <w:bCs w:val="false"/>
-        <w:i w:val="false"/>
-        <w:i w:val="false"/>
-        <w:iCs w:val="false"/>
-        <w:caps w:val="false"/>
-        <w:smallCaps w:val="false"/>
-        <w:strike w:val="false"/>
-        <w:dstrike w:val="false"/>
-        <w:color w:val="000000"/>
-        <w:position w:val="0"/>
-        <w:sz w:val="24"/>
-        <w:sz w:val="24"/>
-        <w:szCs w:val="24"/>
-        <w:u w:val="none"/>
-        <w:shd w:fill="auto" w:val="clear"/>
-        <w:vertAlign w:val="baseline"/>
-      </w:rPr>
-    </w:pPr>
-    <w:r>
-      <w:rPr/>
-      <w:drawing>
-        <wp:inline distT="0" distB="0" distL="0" distR="0">
-          <wp:extent cx="5757545" cy="594360"/>
-          <wp:effectExtent l="0" t="0" r="0" b="0"/>
-          <wp:docPr id="6" name="image2.png" descr=""/>
-          <wp:cNvGraphicFramePr>
-            <a:graphicFrameLocks xmlns:a="http://schemas.openxmlformats.org/drawingml/2006/main" noChangeAspect="1"/>
-          </wp:cNvGraphicFramePr>
-          <a:graphic xmlns:a="http://schemas.openxmlformats.org/drawingml/2006/main">
-            <a:graphicData uri="http://schemas.openxmlformats.org/drawingml/2006/picture">
-              <pic:pic xmlns:pic="http://schemas.openxmlformats.org/drawingml/2006/picture">
-                <pic:nvPicPr>
-                  <pic:cNvPr id="6" name="image2.png" descr=""/>
-                  <pic:cNvPicPr>
-                    <a:picLocks noChangeAspect="1" noChangeArrowheads="1"/>
-                  </pic:cNvPicPr>
-                </pic:nvPicPr>
-                <pic:blipFill>
-                  <a:blip r:embed="rId1"/>
-                  <a:stretch>
-                    <a:fillRect/>
-                  </a:stretch>
-                </pic:blipFill>
-                <pic:spPr bwMode="auto">
-                  <a:xfrm>
-                    <a:off x="0" y="0"/>
-                    <a:ext cx="5757545" cy="594360"/>
-                  </a:xfrm>
-                  <a:prstGeom prst="rect">
-                    <a:avLst/>
-                  </a:prstGeom>
-                </pic:spPr>
-              </pic:pic>
-            </a:graphicData>
-          </a:graphic>
-        </wp:inline>
-      </w:drawing>
-    </w:r>
-  </w:p>
-</w:ftr>
-</file>
-
-<file path=word/footer3.xml><?xml version="1.0" encoding="utf-8"?>
-<w:ftr xmlns:o="urn:schemas-microsoft-com:office:office" xmlns:r="http://schemas.openxmlformats.org/officeDocument/2006/relationships" xmlns:v="urn:schemas-microsoft-com:vml" xmlns:w="http://schemas.openxmlformats.org/wordprocessingml/2006/main" xmlns:w10="urn:schemas-microsoft-com:office:word" xmlns:wp="http://schemas.openxmlformats.org/drawingml/2006/wordprocessingDrawing" xmlns:wps="http://schemas.microsoft.com/office/word/2010/wordprocessingShape" xmlns:wpg="http://schemas.microsoft.com/office/word/2010/wordprocessingGroup" xmlns:mc="http://schemas.openxmlformats.org/markup-compatibility/2006" xmlns:wp14="http://schemas.microsoft.com/office/word/2010/wordprocessingDrawing" xmlns:w14="http://schemas.microsoft.com/office/word/2010/wordml" xmlns:w15="http://schemas.microsoft.com/office/word/2012/wordml" mc:Ignorable="w14 wp14 w15">
-  <w:p>
-    <w:pPr>
-      <w:pStyle w:val="normal1"/>
-      <w:keepNext w:val="false"/>
-      <w:keepLines w:val="false"/>
-      <w:pageBreakBefore w:val="false"/>
-      <w:widowControl/>
-      <w:pBdr/>
       <w:shd w:val="clear" w:fill="auto"/>
       <w:tabs>
         <w:tab w:val="clear" w:pos="720"/>
@@ -10124,6 +9737,89 @@
 </w:ftr>
 </file>
 
+<file path=word/footer3.xml><?xml version="1.0" encoding="utf-8"?>
+<w:ftr xmlns:o="urn:schemas-microsoft-com:office:office" xmlns:r="http://schemas.openxmlformats.org/officeDocument/2006/relationships" xmlns:v="urn:schemas-microsoft-com:vml" xmlns:w="http://schemas.openxmlformats.org/wordprocessingml/2006/main" xmlns:w10="urn:schemas-microsoft-com:office:word" xmlns:wp="http://schemas.openxmlformats.org/drawingml/2006/wordprocessingDrawing" xmlns:wps="http://schemas.microsoft.com/office/word/2010/wordprocessingShape" xmlns:wpg="http://schemas.microsoft.com/office/word/2010/wordprocessingGroup" xmlns:mc="http://schemas.openxmlformats.org/markup-compatibility/2006" xmlns:wp14="http://schemas.microsoft.com/office/word/2010/wordprocessingDrawing" xmlns:w14="http://schemas.microsoft.com/office/word/2010/wordml" xmlns:w15="http://schemas.microsoft.com/office/word/2012/wordml" mc:Ignorable="w14 wp14 w15">
+  <w:p>
+    <w:pPr>
+      <w:pStyle w:val="normal1"/>
+      <w:keepNext w:val="false"/>
+      <w:keepLines w:val="false"/>
+      <w:pageBreakBefore w:val="false"/>
+      <w:widowControl/>
+      <w:shd w:val="clear" w:fill="auto"/>
+      <w:tabs>
+        <w:tab w:val="clear" w:pos="720"/>
+        <w:tab w:val="center" w:pos="4252" w:leader="none"/>
+        <w:tab w:val="right" w:pos="8504" w:leader="none"/>
+      </w:tabs>
+      <w:spacing w:lineRule="auto" w:line="240" w:before="0" w:after="0"/>
+      <w:ind w:hanging="0" w:left="0" w:right="0"/>
+      <w:jc w:val="left"/>
+      <w:rPr>
+        <w:rFonts w:ascii="Times New Roman" w:hAnsi="Times New Roman" w:eastAsia="Times New Roman" w:cs="Times New Roman"/>
+        <w:b w:val="false"/>
+        <w:bCs w:val="false"/>
+        <w:i w:val="false"/>
+        <w:i w:val="false"/>
+        <w:iCs w:val="false"/>
+        <w:caps w:val="false"/>
+        <w:smallCaps w:val="false"/>
+        <w:strike w:val="false"/>
+        <w:dstrike w:val="false"/>
+        <w:color w:val="000000"/>
+        <w:position w:val="0"/>
+        <w:sz w:val="24"/>
+        <w:sz w:val="24"/>
+        <w:szCs w:val="24"/>
+        <w:u w:val="none"/>
+        <w:shd w:fill="auto" w:val="clear"/>
+        <w:vertAlign w:val="baseline"/>
+      </w:rPr>
+    </w:pPr>
+    <w:r>
+      <w:rPr/>
+      <w:drawing>
+        <wp:inline distT="0" distB="0" distL="0" distR="0">
+          <wp:extent cx="5757545" cy="594360"/>
+          <wp:effectExtent l="0" t="0" r="0" b="0"/>
+          <wp:docPr id="8" name="image2.png" descr=""/>
+          <wp:cNvGraphicFramePr>
+            <a:graphicFrameLocks xmlns:a="http://schemas.openxmlformats.org/drawingml/2006/main" noChangeAspect="1"/>
+          </wp:cNvGraphicFramePr>
+          <a:graphic xmlns:a="http://schemas.openxmlformats.org/drawingml/2006/main">
+            <a:graphicData uri="http://schemas.openxmlformats.org/drawingml/2006/picture">
+              <pic:pic xmlns:pic="http://schemas.openxmlformats.org/drawingml/2006/picture">
+                <pic:nvPicPr>
+                  <pic:cNvPr id="8" name="image2.png" descr=""/>
+                  <pic:cNvPicPr>
+                    <a:picLocks noChangeAspect="1" noChangeArrowheads="1"/>
+                  </pic:cNvPicPr>
+                </pic:nvPicPr>
+                <pic:blipFill>
+                  <a:blip r:embed="rId1"/>
+                  <a:stretch>
+                    <a:fillRect/>
+                  </a:stretch>
+                </pic:blipFill>
+                <pic:spPr bwMode="auto">
+                  <a:xfrm>
+                    <a:off x="0" y="0"/>
+                    <a:ext cx="5757545" cy="594360"/>
+                  </a:xfrm>
+                  <a:prstGeom prst="rect">
+                    <a:avLst/>
+                  </a:prstGeom>
+                </pic:spPr>
+              </pic:pic>
+            </a:graphicData>
+          </a:graphic>
+        </wp:inline>
+      </w:drawing>
+    </w:r>
+  </w:p>
+</w:ftr>
+</file>
+
 <file path=word/header1.xml><?xml version="1.0" encoding="utf-8"?>
 <w:hdr xmlns:o="urn:schemas-microsoft-com:office:office" xmlns:r="http://schemas.openxmlformats.org/officeDocument/2006/relationships" xmlns:v="urn:schemas-microsoft-com:vml" xmlns:w="http://schemas.openxmlformats.org/wordprocessingml/2006/main" xmlns:w10="urn:schemas-microsoft-com:office:word" xmlns:wp="http://schemas.openxmlformats.org/drawingml/2006/wordprocessingDrawing" xmlns:wps="http://schemas.microsoft.com/office/word/2010/wordprocessingShape" xmlns:wpg="http://schemas.microsoft.com/office/word/2010/wordprocessingGroup" xmlns:mc="http://schemas.openxmlformats.org/markup-compatibility/2006" xmlns:wp14="http://schemas.microsoft.com/office/word/2010/wordprocessingDrawing" xmlns:w14="http://schemas.microsoft.com/office/word/2010/wordml" xmlns:w15="http://schemas.microsoft.com/office/word/2012/wordml" mc:Ignorable="w14 wp14 w15">
   <w:p>
@@ -10147,7 +9843,6 @@
       <w:keepLines w:val="false"/>
       <w:pageBreakBefore w:val="false"/>
       <w:widowControl/>
-      <w:pBdr/>
       <w:shd w:val="clear" w:fill="auto"/>
       <w:tabs>
         <w:tab w:val="clear" w:pos="720"/>
@@ -10199,7 +9894,7 @@
         <w:vertAlign w:val="baseline"/>
       </w:rPr>
       <w:drawing>
-        <wp:anchor behindDoc="1" distT="0" distB="0" distL="0" distR="0" simplePos="0" locked="0" layoutInCell="1" allowOverlap="1" relativeHeight="12">
+        <wp:anchor behindDoc="1" distT="0" distB="0" distL="0" distR="0" simplePos="0" locked="0" layoutInCell="1" allowOverlap="1" relativeHeight="14">
           <wp:simplePos x="0" y="0"/>
           <wp:positionH relativeFrom="column">
             <wp:posOffset>-106680</wp:posOffset>
@@ -10210,7 +9905,7 @@
           <wp:extent cx="2665730" cy="803910"/>
           <wp:effectExtent l="0" t="0" r="0" b="0"/>
           <wp:wrapNone/>
-          <wp:docPr id="4" name="image1.png" descr=""/>
+          <wp:docPr id="5" name="image1.png" descr=""/>
           <wp:cNvGraphicFramePr>
             <a:graphicFrameLocks xmlns:a="http://schemas.openxmlformats.org/drawingml/2006/main" noChangeAspect="1"/>
           </wp:cNvGraphicFramePr>
@@ -10218,7 +9913,7 @@
             <a:graphicData uri="http://schemas.openxmlformats.org/drawingml/2006/picture">
               <pic:pic xmlns:pic="http://schemas.openxmlformats.org/drawingml/2006/picture">
                 <pic:nvPicPr>
-                  <pic:cNvPr id="4" name="image1.png" descr=""/>
+                  <pic:cNvPr id="5" name="image1.png" descr=""/>
                   <pic:cNvPicPr>
                     <a:picLocks noChangeAspect="1" noChangeArrowheads="1"/>
                   </pic:cNvPicPr>
@@ -10253,7 +9948,6 @@
       <w:keepLines w:val="false"/>
       <w:pageBreakBefore w:val="false"/>
       <w:widowControl/>
-      <w:pBdr/>
       <w:shd w:val="clear" w:fill="auto"/>
       <w:tabs>
         <w:tab w:val="clear" w:pos="720"/>
@@ -10313,7 +10007,6 @@
       <w:keepLines w:val="false"/>
       <w:pageBreakBefore w:val="false"/>
       <w:widowControl/>
-      <w:pBdr/>
       <w:shd w:val="clear" w:fill="auto"/>
       <w:tabs>
         <w:tab w:val="clear" w:pos="720"/>
@@ -10373,7 +10066,6 @@
       <w:keepLines w:val="false"/>
       <w:pageBreakBefore w:val="false"/>
       <w:widowControl/>
-      <w:pBdr/>
       <w:shd w:val="clear" w:fill="auto"/>
       <w:tabs>
         <w:tab w:val="clear" w:pos="720"/>
@@ -10433,7 +10125,6 @@
       <w:keepLines w:val="false"/>
       <w:pageBreakBefore w:val="false"/>
       <w:widowControl/>
-      <w:pBdr/>
       <w:shd w:val="clear" w:fill="auto"/>
       <w:tabs>
         <w:tab w:val="clear" w:pos="720"/>
@@ -10498,7 +10189,6 @@
       <w:keepLines w:val="false"/>
       <w:pageBreakBefore w:val="false"/>
       <w:widowControl/>
-      <w:pBdr/>
       <w:shd w:val="clear" w:fill="auto"/>
       <w:tabs>
         <w:tab w:val="clear" w:pos="720"/>
@@ -10550,7 +10240,7 @@
         <w:vertAlign w:val="baseline"/>
       </w:rPr>
       <w:drawing>
-        <wp:anchor behindDoc="1" distT="0" distB="0" distL="0" distR="0" simplePos="0" locked="0" layoutInCell="1" allowOverlap="1" relativeHeight="12">
+        <wp:anchor behindDoc="1" distT="0" distB="0" distL="0" distR="0" simplePos="0" locked="0" layoutInCell="1" allowOverlap="1" relativeHeight="14">
           <wp:simplePos x="0" y="0"/>
           <wp:positionH relativeFrom="column">
             <wp:posOffset>-106680</wp:posOffset>
@@ -10561,7 +10251,7 @@
           <wp:extent cx="2665730" cy="803910"/>
           <wp:effectExtent l="0" t="0" r="0" b="0"/>
           <wp:wrapNone/>
-          <wp:docPr id="5" name="image1.png" descr=""/>
+          <wp:docPr id="6" name="image1.png" descr=""/>
           <wp:cNvGraphicFramePr>
             <a:graphicFrameLocks xmlns:a="http://schemas.openxmlformats.org/drawingml/2006/main" noChangeAspect="1"/>
           </wp:cNvGraphicFramePr>
@@ -10569,7 +10259,7 @@
             <a:graphicData uri="http://schemas.openxmlformats.org/drawingml/2006/picture">
               <pic:pic xmlns:pic="http://schemas.openxmlformats.org/drawingml/2006/picture">
                 <pic:nvPicPr>
-                  <pic:cNvPr id="5" name="image1.png" descr=""/>
+                  <pic:cNvPr id="6" name="image1.png" descr=""/>
                   <pic:cNvPicPr>
                     <a:picLocks noChangeAspect="1" noChangeArrowheads="1"/>
                   </pic:cNvPicPr>
@@ -10604,7 +10294,6 @@
       <w:keepLines w:val="false"/>
       <w:pageBreakBefore w:val="false"/>
       <w:widowControl/>
-      <w:pBdr/>
       <w:shd w:val="clear" w:fill="auto"/>
       <w:tabs>
         <w:tab w:val="clear" w:pos="720"/>
@@ -10664,7 +10353,6 @@
       <w:keepLines w:val="false"/>
       <w:pageBreakBefore w:val="false"/>
       <w:widowControl/>
-      <w:pBdr/>
       <w:shd w:val="clear" w:fill="auto"/>
       <w:tabs>
         <w:tab w:val="clear" w:pos="720"/>
@@ -10724,7 +10412,6 @@
       <w:keepLines w:val="false"/>
       <w:pageBreakBefore w:val="false"/>
       <w:widowControl/>
-      <w:pBdr/>
       <w:shd w:val="clear" w:fill="auto"/>
       <w:tabs>
         <w:tab w:val="clear" w:pos="720"/>
@@ -10784,7 +10471,6 @@
       <w:keepLines w:val="false"/>
       <w:pageBreakBefore w:val="false"/>
       <w:widowControl/>
-      <w:pBdr/>
       <w:shd w:val="clear" w:fill="auto"/>
       <w:tabs>
         <w:tab w:val="clear" w:pos="720"/>
@@ -10995,6 +10681,7 @@
         <w:vertAlign w:val="baseline"/>
         <w:position w:val="0"/>
         <w:sz w:val="24"/>
+        <w:sz w:val="24"/>
       </w:rPr>
     </w:lvl>
     <w:lvl w:ilvl="1">
@@ -11271,6 +10958,7 @@
     <w:qFormat/>
     <w:pPr>
       <w:widowControl/>
+      <w:suppressAutoHyphens w:val="true"/>
       <w:bidi w:val="0"/>
       <w:spacing w:before="0" w:after="0"/>
       <w:jc w:val="left"/>
@@ -11504,6 +11192,7 @@
     <w:qFormat/>
     <w:pPr>
       <w:widowControl/>
+      <w:suppressAutoHyphens w:val="true"/>
       <w:bidi w:val="0"/>
       <w:spacing w:before="0" w:after="0"/>
       <w:jc w:val="left"/>
@@ -11592,6 +11281,29 @@
     <w:rPr>
       <w:sz w:val="20"/>
       <w:szCs w:val="20"/>
+    </w:rPr>
+  </w:style>
+  <w:style w:type="paragraph" w:styleId="TableContents">
+    <w:name w:val="Table Contents"/>
+    <w:basedOn w:val="Normal"/>
+    <w:qFormat/>
+    <w:pPr>
+      <w:widowControl w:val="false"/>
+      <w:suppressLineNumbers/>
+    </w:pPr>
+    <w:rPr/>
+  </w:style>
+  <w:style w:type="paragraph" w:styleId="TableHeading">
+    <w:name w:val="Table Heading"/>
+    <w:basedOn w:val="TableContents"/>
+    <w:qFormat/>
+    <w:pPr>
+      <w:suppressLineNumbers/>
+      <w:jc w:val="center"/>
+    </w:pPr>
+    <w:rPr>
+      <w:b/>
+      <w:bCs/>
     </w:rPr>
   </w:style>
   <w:style w:type="table" w:default="1" w:styleId="TableNormal">

</xml_diff>